<commit_message>
Revised Architecture and updated plans
</commit_message>
<xml_diff>
--- a/Documentation/Inferno Jockey Details.docx
+++ b/Documentation/Inferno Jockey Details.docx
@@ -54,11 +54,28 @@
     </w:p>
     <w:p>
       <w:r>
-        <w:t xml:space="preserve">Screen/play area will be divided into 6 equal sized lanes. Three on the top half of the phone/tablet/play area, and three on the bottom. </w:t>
+        <w:t xml:space="preserve">Screen/play area will be divided into </w:t>
+      </w:r>
+      <w:r>
+        <w:t>9</w:t>
+      </w:r>
+      <w:r>
+        <w:t xml:space="preserve"> equal sized lanes. </w:t>
       </w:r>
       <w:r>
         <w:t xml:space="preserve">The camera will be the player. There will be no player drone. Essentially it will be as though the drone the player controls will have a camera on its nose. The view area will be big enough to see all of one lane and a little bit of any adjacent lanes. This will be just enough to let the player easily tap on any adjacent lane (including any diagonal up or down from the lane the player is in. </w:t>
       </w:r>
+      <w:r>
+        <w:t xml:space="preserve">The camera will be positioned to let the player see 1 full lane and a little bit of any surrounding lanes (just enough to give a peak of what might be in that lane and to use the lane as navigation as planned). The middle lane (lane 5) will be the only lane where they can see (in part) all 9 lanes of actual play. Out side of the play area (where the actual action takes place, there will be more lanes going up and to the sides of the play area. Below will be lava. Initially, there will only be one unofficial lane outside of the play area, eventually I want to use procedural generation to create the whole world of </w:t>
+      </w:r>
+      <w:proofErr w:type="spellStart"/>
+      <w:r>
+        <w:t>Krneal</w:t>
+      </w:r>
+      <w:proofErr w:type="spellEnd"/>
+      <w:r>
+        <w:t xml:space="preserve">. </w:t>
+      </w:r>
     </w:p>
     <w:p>
       <w:r>
@@ -166,12 +183,15 @@
         <w:t xml:space="preserve">While each planet developed its own unique languages, each of those languages </w:t>
       </w:r>
       <w:r>
-        <w:t xml:space="preserve">has a sister language on each other planet. Even if you go back to long extinct languages from before there was even methods of long distant communication, you can find the same patterns of similar languages. And while there will be differences in these languages, it would be akin to the difference between American English and British English, or Mexican Spanish and Spain Spanish. </w:t>
-      </w:r>
-    </w:p>
-    <w:p>
+        <w:t xml:space="preserve">has a sister language on each other planet. Even if you go back to long extinct languages from </w:t>
+      </w:r>
       <w:r>
         <w:lastRenderedPageBreak/>
+        <w:t xml:space="preserve">before there was even methods of long distant communication, you can find the same patterns of similar languages. And while there will be differences in these languages, it would be akin to the difference between American English and British English, or Mexican Spanish and Spain Spanish. </w:t>
+      </w:r>
+    </w:p>
+    <w:p>
+      <w:r>
         <w:t xml:space="preserve">Genetic analysis of not just the intelligent species of the galaxy, but also all forms of fauna including insects and even water based life, all point to shared ancestors in their various genus and families the individual groups of species would belong to. The same concept applies also to the plants, within their various categorizations, they seem to share a similar origin. </w:t>
       </w:r>
     </w:p>
@@ -264,6 +284,7 @@
     </w:p>
     <w:p>
       <w:r>
+        <w:lastRenderedPageBreak/>
         <w:t>The player will then (ideally) checks for available contracts from</w:t>
       </w:r>
       <w:r>
@@ -319,7 +340,6 @@
         </w:numPr>
       </w:pPr>
       <w:r>
-        <w:lastRenderedPageBreak/>
         <w:t xml:space="preserve">100 </w:t>
       </w:r>
       <w:proofErr w:type="spellStart"/>
@@ -552,7 +572,11 @@
       </w:r>
       <w:proofErr w:type="spellEnd"/>
       <w:r>
-        <w:t xml:space="preserve">, 2 Therion, and </w:t>
+        <w:t xml:space="preserve">, 2 </w:t>
+      </w:r>
+      <w:r>
+        <w:lastRenderedPageBreak/>
+        <w:t xml:space="preserve">Therion, and </w:t>
       </w:r>
       <w:r>
         <w:t xml:space="preserve">1 </w:t>
@@ -574,8 +598,385 @@
     </w:p>
     <w:p>
       <w:r>
+        <w:t xml:space="preserve">They then go to the contracts tab, find they still have 6 minutes to turn in ore, so they try another run but this time they choose the </w:t>
+      </w:r>
+      <w:proofErr w:type="spellStart"/>
+      <w:r>
+        <w:t>Pyroclast</w:t>
+      </w:r>
+      <w:proofErr w:type="spellEnd"/>
+      <w:r>
+        <w:t xml:space="preserve"> Veins</w:t>
+      </w:r>
+      <w:r>
+        <w:t xml:space="preserve"> to still try to get higher pay while not quite as many obstacles to face. In their run, they just collect another 10 ore samples, but messed up on the last obstacle, and ran into a mine. The pirates stole 1 sample of ore from them, which turned out to be the only </w:t>
+      </w:r>
+      <w:r>
+        <w:t xml:space="preserve">sample of </w:t>
+      </w:r>
+      <w:proofErr w:type="spellStart"/>
+      <w:r>
+        <w:t>Vythar</w:t>
+      </w:r>
+      <w:proofErr w:type="spellEnd"/>
+      <w:r>
+        <w:t xml:space="preserve"> they collected, leaving them with 7 Therion ore samples and 2 </w:t>
+      </w:r>
+      <w:proofErr w:type="spellStart"/>
+      <w:r>
+        <w:t>Kaelar</w:t>
+      </w:r>
+      <w:proofErr w:type="spellEnd"/>
+      <w:r>
+        <w:t xml:space="preserve"> ore samples collected. They then turn in their contract with 2 minutes to spare and get paid 6,100 </w:t>
+      </w:r>
+      <w:proofErr w:type="spellStart"/>
+      <w:r>
+        <w:t>Derrenni</w:t>
+      </w:r>
+      <w:proofErr w:type="spellEnd"/>
+      <w:r>
+        <w:t xml:space="preserve">. Their 2 drones cost them 1,000 each, and the runs were short enough to not need fuel or laser core replacement, so that left them with 5,100 </w:t>
+      </w:r>
+      <w:proofErr w:type="spellStart"/>
+      <w:r>
+        <w:t>Derrenni</w:t>
+      </w:r>
+      <w:proofErr w:type="spellEnd"/>
+      <w:r>
+        <w:t xml:space="preserve"> profit. </w:t>
+      </w:r>
+    </w:p>
+    <w:p>
+      <w:r>
+        <w:t xml:space="preserve">Future versions of the game will add an idle gameplay element where they hire other Inferno Jockeys to work underneath them and will have upgrades that will benefit both the idle gameplay and </w:t>
+      </w:r>
+      <w:r>
+        <w:t>their</w:t>
+      </w:r>
+      <w:r>
+        <w:t xml:space="preserve"> own runs. </w:t>
+      </w:r>
+    </w:p>
+    <w:p>
+      <w:r>
+        <w:t xml:space="preserve">Two days later, the player loads up the game, it automatically loads up their save data, they choose a 1,000 ore contract, and happily spend the next 3 days collecting the ore to fill their contract, and get good enough at running the </w:t>
+      </w:r>
+      <w:proofErr w:type="spellStart"/>
+      <w:r>
+        <w:t>Pyroclast</w:t>
+      </w:r>
+      <w:proofErr w:type="spellEnd"/>
+      <w:r>
+        <w:t xml:space="preserve"> Veins</w:t>
+      </w:r>
+      <w:r>
+        <w:t xml:space="preserve">, that they discover that after collecting about 300 ore from it, that they end up moving into the </w:t>
+      </w:r>
+      <w:r>
+        <w:t>Molten</w:t>
+      </w:r>
+      <w:r>
+        <w:t xml:space="preserve"> </w:t>
+      </w:r>
+      <w:r>
+        <w:t>Crucible</w:t>
+      </w:r>
+      <w:r>
+        <w:t>.</w:t>
+      </w:r>
+    </w:p>
+    <w:p>
+      <w:pPr>
+        <w:pStyle w:val="Heading2"/>
+      </w:pPr>
+      <w:r>
+        <w:t>Movement</w:t>
+      </w:r>
+    </w:p>
+    <w:p>
+      <w:r>
+        <w:t xml:space="preserve">Controls will be invisible buttons that fill each of the </w:t>
+      </w:r>
+      <w:r>
+        <w:t>9</w:t>
+      </w:r>
+      <w:r>
+        <w:t xml:space="preserve"> lanes. The first tap/click of a button will move you to a lane (with a visible but short movement animation). If you are already in a lane and click on it again, then you will fire your laser.</w:t>
+      </w:r>
+    </w:p>
+    <w:p>
+      <w:pPr>
+        <w:pStyle w:val="Heading2"/>
+      </w:pPr>
+      <w:r>
+        <w:t xml:space="preserve">Play Area </w:t>
+      </w:r>
+    </w:p>
+    <w:p>
+      <w:r>
+        <w:t xml:space="preserve">The main play area is divided into 9 lanes. Below the play area is lava, </w:t>
+      </w:r>
+      <w:r>
+        <w:t xml:space="preserve">above and to the sides of the play area is open air. If there is no obstacles between the lanes and the area to the side and above the lanes, then I want the player to be able to take the drone out there, but there will not be any drops or any ore out there. </w:t>
+      </w:r>
+    </w:p>
+    <w:p>
+      <w:r>
+        <w:t xml:space="preserve">For initial release, after they get out of the main play area, there will not be any more empty lanes to move in. Eventually, I will use procedural generation to simulate the whole planet of </w:t>
+      </w:r>
+      <w:proofErr w:type="spellStart"/>
+      <w:r>
+        <w:t>Krneal</w:t>
+      </w:r>
+      <w:proofErr w:type="spellEnd"/>
+      <w:r>
+        <w:t xml:space="preserve">. It will be mostly molten lava. </w:t>
+      </w:r>
+    </w:p>
+    <w:p>
+      <w:pPr>
+        <w:pStyle w:val="Heading2"/>
+      </w:pPr>
+      <w:r>
         <w:lastRenderedPageBreak/>
-        <w:t xml:space="preserve">They then go to the contracts tab, find they still have 6 minutes to turn in ore, so they try another run but this time they choose the </w:t>
+        <w:t>Collectables</w:t>
+      </w:r>
+    </w:p>
+    <w:p>
+      <w:r>
+        <w:t>The base level drone can only hold one extra fuel canister, higher level drones can hold more. The initial version of the game, will only have one drone</w:t>
+      </w:r>
+      <w:r>
+        <w:t xml:space="preserve"> (only visible in the main menu before starting a run)</w:t>
+      </w:r>
+      <w:r>
+        <w:t xml:space="preserve">, one fuel canister, and one laser core. </w:t>
+      </w:r>
+    </w:p>
+    <w:p>
+      <w:r>
+        <w:t xml:space="preserve">Fuel = Canisters containing fuel to refuel the drone midflight. Explosive if shot. To collect it, you must simply fly your drone </w:t>
+      </w:r>
+      <w:r>
+        <w:t>through</w:t>
+      </w:r>
+      <w:r>
+        <w:t xml:space="preserve"> it. </w:t>
+      </w:r>
+      <w:r>
+        <w:t xml:space="preserve">Cost to be determined. </w:t>
+      </w:r>
+      <w:r>
+        <w:t xml:space="preserve">Depletion rate to be determined, likely 1 unit per second at base but I will figure that out upon playing it a bit and will be set based on what feels fun. The base level drone will only have one compatible fuel canister. Higher level drones will have multiple </w:t>
+      </w:r>
+      <w:r>
+        <w:t xml:space="preserve">that will carry more fuel allowing longer times between refueling. </w:t>
+      </w:r>
+    </w:p>
+    <w:p>
+      <w:r>
+        <w:t xml:space="preserve">Laser Cores = The laser core of the drone depletes over time; these provide replacement laser cores to allow the drone to continue to shoot the laser. Will be destroyed if shot. To collect it, you must simply fly your drone </w:t>
+      </w:r>
+      <w:r>
+        <w:t xml:space="preserve">through </w:t>
+      </w:r>
+      <w:r>
+        <w:t>it.</w:t>
+      </w:r>
+      <w:r>
+        <w:t xml:space="preserve"> The number of shots each laser</w:t>
+      </w:r>
+      <w:r>
+        <w:t xml:space="preserve"> core can fire</w:t>
+      </w:r>
+      <w:r>
+        <w:t xml:space="preserve"> before it needs to be replaced will be determined by what feels fun.  </w:t>
+      </w:r>
+      <w:r>
+        <w:t>Cost to be determined.</w:t>
+      </w:r>
+      <w:r>
+        <w:t xml:space="preserve"> Number of shots to be determined. </w:t>
+      </w:r>
+      <w:r>
+        <w:t>The base level drone will only have one option for laser cores. Higher level drones will have multiple options for laser cores that can shoot more lasers before depleting. The base level drone can only hold one extra laser core,</w:t>
+      </w:r>
+      <w:r>
+        <w:t xml:space="preserve"> </w:t>
+      </w:r>
+      <w:r>
+        <w:t xml:space="preserve">higher level drones can hold more. </w:t>
+      </w:r>
+    </w:p>
+    <w:p/>
+    <w:p>
+      <w:proofErr w:type="spellStart"/>
+      <w:r>
+        <w:t>Kytherium</w:t>
+      </w:r>
+      <w:proofErr w:type="spellEnd"/>
+      <w:r>
+        <w:t xml:space="preserve"> = The thing you are being paid to collect. When harvested</w:t>
+      </w:r>
+      <w:r>
+        <w:t xml:space="preserve"> from the lava</w:t>
+      </w:r>
+      <w:r>
+        <w:t xml:space="preserve"> by the automated machinery the </w:t>
+      </w:r>
+      <w:proofErr w:type="spellStart"/>
+      <w:r>
+        <w:t>Kytherium</w:t>
+      </w:r>
+      <w:proofErr w:type="spellEnd"/>
+      <w:r>
+        <w:t xml:space="preserve"> will be coated in hardened lava. To collect </w:t>
+      </w:r>
+      <w:proofErr w:type="spellStart"/>
+      <w:r>
+        <w:t>Kytherium</w:t>
+      </w:r>
+      <w:proofErr w:type="spellEnd"/>
+      <w:r>
+        <w:t xml:space="preserve">, you must first shoot it with your laser, then simply fly your drone </w:t>
+      </w:r>
+      <w:r>
+        <w:t xml:space="preserve">through </w:t>
+      </w:r>
+      <w:r>
+        <w:t xml:space="preserve">the </w:t>
+      </w:r>
+      <w:proofErr w:type="spellStart"/>
+      <w:r>
+        <w:t>Kytherium</w:t>
+      </w:r>
+      <w:proofErr w:type="spellEnd"/>
+      <w:r>
+        <w:t xml:space="preserve"> and your ship will collect it.</w:t>
+      </w:r>
+      <w:r>
+        <w:t xml:space="preserve"> If you do not first clear the lava off the </w:t>
+      </w:r>
+      <w:proofErr w:type="spellStart"/>
+      <w:r>
+        <w:t>Kytherium</w:t>
+      </w:r>
+      <w:proofErr w:type="spellEnd"/>
+      <w:r>
+        <w:t xml:space="preserve">, then your drone will be destroyed. The natives to </w:t>
+      </w:r>
+      <w:proofErr w:type="spellStart"/>
+      <w:r>
+        <w:t>Krneal</w:t>
+      </w:r>
+      <w:proofErr w:type="spellEnd"/>
+      <w:r>
+        <w:t xml:space="preserve"> do not want you taking their lava, and will destroy your drone if you try to take any lava.</w:t>
+      </w:r>
+      <w:r>
+        <w:t xml:space="preserve"> </w:t>
+      </w:r>
+      <w:r>
+        <w:t xml:space="preserve">Initially, it will appear that the drone simply crashed on the lava over the </w:t>
+      </w:r>
+      <w:proofErr w:type="spellStart"/>
+      <w:r>
+        <w:t>Kytherium</w:t>
+      </w:r>
+      <w:proofErr w:type="spellEnd"/>
+      <w:r>
+        <w:t xml:space="preserve">. I might add a spike or tentacle hitting the drone later. </w:t>
+      </w:r>
+    </w:p>
+    <w:p>
+      <w:proofErr w:type="spellStart"/>
+      <w:r>
+        <w:t>Kytherium</w:t>
+      </w:r>
+      <w:proofErr w:type="spellEnd"/>
+      <w:r>
+        <w:t xml:space="preserve"> comes in 4 grades. </w:t>
+      </w:r>
+    </w:p>
+    <w:p>
+      <w:proofErr w:type="spellStart"/>
+      <w:r>
+        <w:t>Vythar</w:t>
+      </w:r>
+      <w:proofErr w:type="spellEnd"/>
+      <w:r>
+        <w:t xml:space="preserve"> = The basic version of </w:t>
+      </w:r>
+      <w:proofErr w:type="spellStart"/>
+      <w:r>
+        <w:t>Kytherium</w:t>
+      </w:r>
+      <w:proofErr w:type="spellEnd"/>
+      <w:r>
+        <w:t xml:space="preserve"> and the least profitable to gather. Prevalent in the </w:t>
+      </w:r>
+      <w:proofErr w:type="spellStart"/>
+      <w:r>
+        <w:t>Emberflow</w:t>
+      </w:r>
+      <w:proofErr w:type="spellEnd"/>
+      <w:r>
+        <w:t xml:space="preserve"> Shallows</w:t>
+      </w:r>
+    </w:p>
+    <w:p>
+      <w:proofErr w:type="spellStart"/>
+      <w:r>
+        <w:t>Kaelar</w:t>
+      </w:r>
+      <w:proofErr w:type="spellEnd"/>
+      <w:r>
+        <w:t xml:space="preserve"> = The </w:t>
+      </w:r>
+      <w:r>
+        <w:t>second-tier</w:t>
+      </w:r>
+      <w:r>
+        <w:t xml:space="preserve"> quality version of </w:t>
+      </w:r>
+      <w:proofErr w:type="spellStart"/>
+      <w:r>
+        <w:t>Kytherium</w:t>
+      </w:r>
+      <w:proofErr w:type="spellEnd"/>
+      <w:r>
+        <w:t xml:space="preserve">. Prevalent in the </w:t>
+      </w:r>
+      <w:proofErr w:type="spellStart"/>
+      <w:r>
+        <w:t>Magmaweave</w:t>
+      </w:r>
+      <w:proofErr w:type="spellEnd"/>
+      <w:r>
+        <w:t xml:space="preserve">. </w:t>
+      </w:r>
+    </w:p>
+    <w:p>
+      <w:r>
+        <w:t>Therion</w:t>
+      </w:r>
+      <w:r>
+        <w:t xml:space="preserve"> = The </w:t>
+      </w:r>
+      <w:r>
+        <w:t>third-tier</w:t>
+      </w:r>
+      <w:r>
+        <w:t xml:space="preserve"> quality version of </w:t>
+      </w:r>
+      <w:proofErr w:type="spellStart"/>
+      <w:r>
+        <w:t>Kytherium</w:t>
+      </w:r>
+      <w:proofErr w:type="spellEnd"/>
+      <w:r>
+        <w:t xml:space="preserve">. Prevalent in the </w:t>
       </w:r>
       <w:proofErr w:type="spellStart"/>
       <w:r>
@@ -586,18 +987,163 @@
         <w:t xml:space="preserve"> Veins</w:t>
       </w:r>
       <w:r>
-        <w:t xml:space="preserve"> to still try to get higher pay while not quite as many obstacles to face. In their run, they just collect another 10 ore samples, but messed up on the last obstacle, and ran into a mine. The pirates stole 1 sample of ore from them, which turned out to be the only </w:t>
-      </w:r>
-      <w:r>
-        <w:t xml:space="preserve">sample of </w:t>
-      </w:r>
-      <w:proofErr w:type="spellStart"/>
+        <w:t xml:space="preserve">. </w:t>
+      </w:r>
+    </w:p>
+    <w:p>
+      <w:proofErr w:type="spellStart"/>
+      <w:r>
+        <w:t>Atherion</w:t>
+      </w:r>
+      <w:proofErr w:type="spellEnd"/>
+      <w:r>
+        <w:t xml:space="preserve"> = The most valuable version of </w:t>
+      </w:r>
+      <w:proofErr w:type="spellStart"/>
+      <w:r>
+        <w:t>Kytherium</w:t>
+      </w:r>
+      <w:proofErr w:type="spellEnd"/>
+      <w:r>
+        <w:t xml:space="preserve">. Prevalent in the </w:t>
+      </w:r>
+      <w:r>
+        <w:t>Molten</w:t>
+      </w:r>
+      <w:r>
+        <w:t xml:space="preserve"> </w:t>
+      </w:r>
+      <w:r>
+        <w:t>Crucible</w:t>
+      </w:r>
+      <w:r>
+        <w:t xml:space="preserve">. </w:t>
+      </w:r>
+    </w:p>
+    <w:p>
+      <w:pPr>
+        <w:pStyle w:val="Heading2"/>
+      </w:pPr>
+      <w:r>
+        <w:lastRenderedPageBreak/>
+        <w:t>Difficulty Settings</w:t>
+      </w:r>
+    </w:p>
+    <w:p>
+      <w:r>
+        <w:t xml:space="preserve">The lower difficulty settings have lower quality </w:t>
+      </w:r>
+      <w:proofErr w:type="spellStart"/>
+      <w:r>
+        <w:t>Kytherium</w:t>
+      </w:r>
+      <w:proofErr w:type="spellEnd"/>
+      <w:r>
+        <w:t xml:space="preserve">. The </w:t>
+      </w:r>
+      <w:r>
+        <w:t xml:space="preserve">higher the difficulty settings, the more competition you have, and the harder you have to work to collect the ore. </w:t>
+      </w:r>
+      <w:r>
+        <w:t>At first, t</w:t>
+      </w:r>
+      <w:r>
+        <w:t>he lowest difficulty just has pipes to dodge. The higher the difficulty</w:t>
+      </w:r>
+      <w:r>
+        <w:t xml:space="preserve"> or the further you progress in the run</w:t>
+      </w:r>
+      <w:r>
+        <w:t>, the more obstacles and more variety of obstacles you have to deal with</w:t>
+      </w:r>
+      <w:r>
+        <w:t xml:space="preserve"> (though initially, there will only be mines added other obstacles will be added in future patches)</w:t>
+      </w:r>
+      <w:r>
+        <w:t xml:space="preserve">. You also get paid more for the ore from the higher difficulties. </w:t>
+      </w:r>
+      <w:r>
+        <w:t xml:space="preserve">The </w:t>
+      </w:r>
+      <w:proofErr w:type="spellStart"/>
+      <w:r>
+        <w:t>Emberflow</w:t>
+      </w:r>
+      <w:proofErr w:type="spellEnd"/>
+      <w:r>
+        <w:t xml:space="preserve"> Shallows</w:t>
+      </w:r>
+      <w:r>
+        <w:t xml:space="preserve">, </w:t>
+      </w:r>
+      <w:proofErr w:type="spellStart"/>
+      <w:r>
+        <w:t>Magmaweave</w:t>
+      </w:r>
+      <w:proofErr w:type="spellEnd"/>
+      <w:r>
+        <w:t xml:space="preserve">, and </w:t>
+      </w:r>
+      <w:proofErr w:type="spellStart"/>
+      <w:r>
+        <w:t>Pyroclast</w:t>
+      </w:r>
+      <w:proofErr w:type="spellEnd"/>
+      <w:r>
+        <w:t xml:space="preserve"> Veins</w:t>
+      </w:r>
+      <w:r>
+        <w:t xml:space="preserve"> are not truly endless. After a certain point in each, you will advance to the next region. The </w:t>
+      </w:r>
+      <w:r>
+        <w:t>Molten</w:t>
+      </w:r>
+      <w:r>
+        <w:t xml:space="preserve"> </w:t>
+      </w:r>
+      <w:r>
+        <w:t>Crucible</w:t>
+      </w:r>
+      <w:r>
+        <w:t xml:space="preserve"> is truly endless, if you start in it, you will continue in that region until your run ends. </w:t>
+      </w:r>
+    </w:p>
+    <w:p>
+      <w:r>
+        <w:t xml:space="preserve">All regions are only guaranteed 1 safe lane, though the higher difficulty settings or the farther you progress in a run you will be more likely to have to deal with more obstacles filling more lanes. </w:t>
+      </w:r>
+    </w:p>
+    <w:p>
+      <w:proofErr w:type="spellStart"/>
+      <w:r>
+        <w:t>Emberflow</w:t>
+      </w:r>
+      <w:proofErr w:type="spellEnd"/>
+      <w:r>
+        <w:t xml:space="preserve"> Shallows</w:t>
+      </w:r>
+      <w:r>
+        <w:t xml:space="preserve"> = Easy</w:t>
+      </w:r>
+      <w:r>
+        <w:t xml:space="preserve">. </w:t>
+      </w:r>
+      <w:r>
+        <w:t>Ore value and drop rates and obstacle spawn rates x1</w:t>
+      </w:r>
+      <w:r>
+        <w:t xml:space="preserve">. </w:t>
+      </w:r>
+    </w:p>
+    <w:p>
+      <w:r>
+        <w:t xml:space="preserve">For ore drops, 70% will be </w:t>
+      </w:r>
       <w:r>
         <w:t>Vythar</w:t>
       </w:r>
-      <w:proofErr w:type="spellEnd"/>
-      <w:r>
-        <w:t xml:space="preserve"> they collected, leaving them with 7 Therion ore samples and 2 </w:t>
+      <w:r>
+        <w:t xml:space="preserve">, 15% will be </w:t>
       </w:r>
       <w:proofErr w:type="spellStart"/>
       <w:r>
@@ -605,40 +1151,83 @@
       </w:r>
       <w:proofErr w:type="spellEnd"/>
       <w:r>
-        <w:t xml:space="preserve"> ore samples collected. They then turn in their contract with 2 minutes to spare and get paid 6,100 </w:t>
-      </w:r>
-      <w:proofErr w:type="spellStart"/>
-      <w:r>
-        <w:t>Derrenni</w:t>
-      </w:r>
-      <w:proofErr w:type="spellEnd"/>
-      <w:r>
-        <w:t xml:space="preserve">. Their 2 drones cost them 1,000 each, and the runs were short enough to not need fuel or laser core replacement, so that left them with 5,100 </w:t>
-      </w:r>
-      <w:proofErr w:type="spellStart"/>
-      <w:r>
-        <w:t>Derrenni</w:t>
-      </w:r>
-      <w:proofErr w:type="spellEnd"/>
-      <w:r>
-        <w:t xml:space="preserve"> profit. </w:t>
-      </w:r>
-    </w:p>
-    <w:p>
-      <w:r>
-        <w:t xml:space="preserve">Future versions of the game will add an idle gameplay element where they hire other Inferno Jockeys to work underneath them and will have upgrades that will benefit both the idle gameplay and </w:t>
-      </w:r>
-      <w:r>
-        <w:t>their</w:t>
-      </w:r>
-      <w:r>
-        <w:t xml:space="preserve"> own runs. </w:t>
-      </w:r>
-    </w:p>
-    <w:p>
-      <w:r>
-        <w:t xml:space="preserve">Two days later, the player loads up the game, it automatically loads up their save data, they choose a 1,000 ore contract, and happily spend the next 3 days collecting the ore to fill their contract, and get good enough at running the </w:t>
-      </w:r>
+        <w:t xml:space="preserve">, 10% will be </w:t>
+      </w:r>
+      <w:r>
+        <w:t>Therion</w:t>
+      </w:r>
+      <w:r>
+        <w:t xml:space="preserve">, and 5% will be </w:t>
+      </w:r>
+      <w:proofErr w:type="spellStart"/>
+      <w:r>
+        <w:t>Atherion</w:t>
+      </w:r>
+      <w:proofErr w:type="spellEnd"/>
+      <w:r>
+        <w:t xml:space="preserve">. </w:t>
+      </w:r>
+    </w:p>
+    <w:p>
+      <w:proofErr w:type="spellStart"/>
+      <w:r>
+        <w:t>Magmaweave</w:t>
+      </w:r>
+      <w:proofErr w:type="spellEnd"/>
+      <w:r>
+        <w:t xml:space="preserve"> = Medium</w:t>
+      </w:r>
+      <w:r>
+        <w:t>.</w:t>
+      </w:r>
+      <w:r>
+        <w:t xml:space="preserve"> </w:t>
+      </w:r>
+      <w:r>
+        <w:t xml:space="preserve"> </w:t>
+      </w:r>
+      <w:r>
+        <w:t>Ore value and drop rates and obstacle spawn rates x2 (subject to change). Additional object types will be added to account for increased obstacle spawn rate.</w:t>
+      </w:r>
+      <w:r>
+        <w:t xml:space="preserve"> </w:t>
+      </w:r>
+    </w:p>
+    <w:p>
+      <w:r>
+        <w:t xml:space="preserve">For ore drops, 70% will be </w:t>
+      </w:r>
+      <w:proofErr w:type="spellStart"/>
+      <w:r>
+        <w:t>Kaelar</w:t>
+      </w:r>
+      <w:proofErr w:type="spellEnd"/>
+      <w:r>
+        <w:t xml:space="preserve">, 15% will be </w:t>
+      </w:r>
+      <w:r>
+        <w:t>Vythar</w:t>
+      </w:r>
+      <w:r>
+        <w:t xml:space="preserve">, 10% will be </w:t>
+      </w:r>
+      <w:r>
+        <w:t>Therion</w:t>
+      </w:r>
+      <w:r>
+        <w:t xml:space="preserve">, and 5% will be </w:t>
+      </w:r>
+      <w:proofErr w:type="spellStart"/>
+      <w:r>
+        <w:t>Atherion</w:t>
+      </w:r>
+      <w:proofErr w:type="spellEnd"/>
+      <w:r>
+        <w:t xml:space="preserve">. </w:t>
+      </w:r>
+    </w:p>
+    <w:p/>
+    <w:p>
       <w:proofErr w:type="spellStart"/>
       <w:r>
         <w:t>Pyroclast</w:t>
@@ -648,8 +1237,53 @@
         <w:t xml:space="preserve"> Veins</w:t>
       </w:r>
       <w:r>
-        <w:t xml:space="preserve">, that they discover that after collecting about 300 ore from it, that they end up moving into the </w:t>
-      </w:r>
+        <w:t xml:space="preserve"> = Hard</w:t>
+      </w:r>
+      <w:r>
+        <w:t>. Ore value and drop rates and obstacle spawn rates x3 (subject to change). Additional object types will be added to account for increased obstacle spawn rate.</w:t>
+      </w:r>
+      <w:r>
+        <w:t xml:space="preserve"> </w:t>
+      </w:r>
+    </w:p>
+    <w:p>
+      <w:r>
+        <w:t xml:space="preserve">For ore drops, 70% will be </w:t>
+      </w:r>
+      <w:r>
+        <w:t>Therion</w:t>
+      </w:r>
+      <w:r>
+        <w:t xml:space="preserve">, 15% will be </w:t>
+      </w:r>
+      <w:proofErr w:type="spellStart"/>
+      <w:r>
+        <w:t>Kaelar</w:t>
+      </w:r>
+      <w:proofErr w:type="spellEnd"/>
+      <w:r>
+        <w:t>, 10% will be</w:t>
+      </w:r>
+      <w:r>
+        <w:t xml:space="preserve"> </w:t>
+      </w:r>
+      <w:r>
+        <w:t>Vythar</w:t>
+      </w:r>
+      <w:r>
+        <w:t xml:space="preserve">, and 5% will be </w:t>
+      </w:r>
+      <w:proofErr w:type="spellStart"/>
+      <w:r>
+        <w:t>Atherion</w:t>
+      </w:r>
+      <w:proofErr w:type="spellEnd"/>
+      <w:r>
+        <w:t xml:space="preserve">. </w:t>
+      </w:r>
+    </w:p>
+    <w:p/>
+    <w:p>
       <w:r>
         <w:t>Molten</w:t>
       </w:r>
@@ -660,634 +1294,21 @@
         <w:t>Crucible</w:t>
       </w:r>
       <w:r>
-        <w:t>.</w:t>
-      </w:r>
-    </w:p>
-    <w:p>
-      <w:pPr>
-        <w:pStyle w:val="Heading2"/>
-      </w:pPr>
-      <w:r>
-        <w:t>Movement</w:t>
-      </w:r>
-    </w:p>
-    <w:p>
-      <w:r>
-        <w:t xml:space="preserve">Controls will be invisible buttons that fill each of the </w:t>
-      </w:r>
-      <w:r>
-        <w:t>9</w:t>
-      </w:r>
-      <w:r>
-        <w:t xml:space="preserve"> lanes. The first tap/click of a button will move you to a lane (with a visible but short movement animation). If you are already in a lane and click on it again, then you will fire your laser.</w:t>
-      </w:r>
-    </w:p>
-    <w:p>
-      <w:pPr>
-        <w:pStyle w:val="Heading2"/>
-      </w:pPr>
-      <w:r>
-        <w:t xml:space="preserve">Play Area </w:t>
-      </w:r>
-    </w:p>
-    <w:p>
-      <w:r>
-        <w:t xml:space="preserve">The main play area is divided into 9 lanes. Below the play area is lava, </w:t>
-      </w:r>
-      <w:r>
-        <w:t xml:space="preserve">above and to the sides of the play area is open air. If there is no obstacles between the lanes and the area to the side and above the lanes, then I want the player to be able to take the drone out there, but there will not be any drops or any ore out there. </w:t>
-      </w:r>
-    </w:p>
-    <w:p>
-      <w:r>
-        <w:t xml:space="preserve">For initial release, after they get out of the main play area, there will not be any more empty lanes to move in. Eventually, I will use procedural generation to simulate the whole planet of </w:t>
-      </w:r>
-      <w:proofErr w:type="spellStart"/>
-      <w:r>
-        <w:t>Krneal</w:t>
-      </w:r>
-      <w:proofErr w:type="spellEnd"/>
-      <w:r>
-        <w:t xml:space="preserve">. It will be mostly molten lava. </w:t>
-      </w:r>
-    </w:p>
-    <w:p>
-      <w:pPr>
-        <w:pStyle w:val="Heading2"/>
-      </w:pPr>
-      <w:r>
-        <w:t>Collectables</w:t>
-      </w:r>
-    </w:p>
-    <w:p>
-      <w:r>
-        <w:t>The base level drone can only hold one extra fuel canister, higher level drones can hold more. The initial version of the game, will only have one drone</w:t>
-      </w:r>
-      <w:r>
-        <w:t xml:space="preserve"> (only visible in the main menu before starting a run)</w:t>
-      </w:r>
-      <w:r>
-        <w:t xml:space="preserve">, one fuel canister, and one laser core. </w:t>
+        <w:t xml:space="preserve"> = Veteran</w:t>
+      </w:r>
+      <w:r>
+        <w:t xml:space="preserve">. </w:t>
+      </w:r>
+      <w:r>
+        <w:t>Ore value and drop rates and obstacle spawn rates x4 (subject to change). Additional object types will be added to account for increased obstacle spawn rate.</w:t>
+      </w:r>
+      <w:r>
+        <w:t xml:space="preserve"> </w:t>
       </w:r>
     </w:p>
     <w:p>
       <w:r>
         <w:lastRenderedPageBreak/>
-        <w:t xml:space="preserve">Fuel = Canisters containing fuel to refuel the drone midflight. Explosive if shot. To collect it, you must simply fly your drone </w:t>
-      </w:r>
-      <w:r>
-        <w:t>through</w:t>
-      </w:r>
-      <w:r>
-        <w:t xml:space="preserve"> it. </w:t>
-      </w:r>
-      <w:r>
-        <w:t xml:space="preserve">Cost to be determined. </w:t>
-      </w:r>
-      <w:r>
-        <w:t xml:space="preserve">Depletion rate to be determined, likely 1 unit per second at base but I will figure that out upon playing it a bit and will be set based on what feels fun. The base level drone will only have one compatible fuel canister. Higher level drones will have multiple </w:t>
-      </w:r>
-      <w:r>
-        <w:t xml:space="preserve">that will carry more fuel allowing longer times between refueling. </w:t>
-      </w:r>
-    </w:p>
-    <w:p>
-      <w:r>
-        <w:t xml:space="preserve">Laser Cores = The laser core of the drone depletes over time; these provide replacement laser cores to allow the drone to continue to shoot the laser. Will be destroyed if shot. To collect it, you must simply fly your drone </w:t>
-      </w:r>
-      <w:r>
-        <w:t xml:space="preserve">through </w:t>
-      </w:r>
-      <w:r>
-        <w:t>it.</w:t>
-      </w:r>
-      <w:r>
-        <w:t xml:space="preserve"> The number of shots each laser</w:t>
-      </w:r>
-      <w:r>
-        <w:t xml:space="preserve"> core can fire</w:t>
-      </w:r>
-      <w:r>
-        <w:t xml:space="preserve"> before it needs to be replaced will be determined by what feels fun.  </w:t>
-      </w:r>
-      <w:r>
-        <w:t>Cost to be determined.</w:t>
-      </w:r>
-      <w:r>
-        <w:t xml:space="preserve"> Number of shots to be determined. </w:t>
-      </w:r>
-      <w:r>
-        <w:t>The base level drone will only have one option for laser cores. Higher level drones will have multiple options for laser cores that can shoot more lasers before depleting. The base level drone can only hold one extra laser core,</w:t>
-      </w:r>
-      <w:r>
-        <w:t xml:space="preserve"> </w:t>
-      </w:r>
-      <w:r>
-        <w:t xml:space="preserve">higher level drones can hold more. </w:t>
-      </w:r>
-    </w:p>
-    <w:p/>
-    <w:p>
-      <w:proofErr w:type="spellStart"/>
-      <w:r>
-        <w:t>Kytherium</w:t>
-      </w:r>
-      <w:proofErr w:type="spellEnd"/>
-      <w:r>
-        <w:t xml:space="preserve"> = The thing you are being paid to collect. When harvested</w:t>
-      </w:r>
-      <w:r>
-        <w:t xml:space="preserve"> from the lava</w:t>
-      </w:r>
-      <w:r>
-        <w:t xml:space="preserve"> by the automated machinery the </w:t>
-      </w:r>
-      <w:proofErr w:type="spellStart"/>
-      <w:r>
-        <w:t>Kytherium</w:t>
-      </w:r>
-      <w:proofErr w:type="spellEnd"/>
-      <w:r>
-        <w:t xml:space="preserve"> will be coated in hardened lava. To collect </w:t>
-      </w:r>
-      <w:proofErr w:type="spellStart"/>
-      <w:r>
-        <w:t>Kytherium</w:t>
-      </w:r>
-      <w:proofErr w:type="spellEnd"/>
-      <w:r>
-        <w:t xml:space="preserve">, you must first shoot it with your laser, then simply fly your drone </w:t>
-      </w:r>
-      <w:r>
-        <w:t xml:space="preserve">through </w:t>
-      </w:r>
-      <w:r>
-        <w:t xml:space="preserve">the </w:t>
-      </w:r>
-      <w:proofErr w:type="spellStart"/>
-      <w:r>
-        <w:t>Kytherium</w:t>
-      </w:r>
-      <w:proofErr w:type="spellEnd"/>
-      <w:r>
-        <w:t xml:space="preserve"> and your ship will collect it.</w:t>
-      </w:r>
-      <w:r>
-        <w:t xml:space="preserve"> If you do not first clear the lava off the </w:t>
-      </w:r>
-      <w:proofErr w:type="spellStart"/>
-      <w:r>
-        <w:t>Kytherium</w:t>
-      </w:r>
-      <w:proofErr w:type="spellEnd"/>
-      <w:r>
-        <w:t xml:space="preserve">, then your drone will be destroyed. The natives to </w:t>
-      </w:r>
-      <w:proofErr w:type="spellStart"/>
-      <w:r>
-        <w:t>Krneal</w:t>
-      </w:r>
-      <w:proofErr w:type="spellEnd"/>
-      <w:r>
-        <w:t xml:space="preserve"> do not want you taking their lava, and will destroy your drone if you try to take any lava.</w:t>
-      </w:r>
-      <w:r>
-        <w:t xml:space="preserve"> </w:t>
-      </w:r>
-      <w:r>
-        <w:t xml:space="preserve">Initially, it will appear that the drone simply crashed on the lava over the </w:t>
-      </w:r>
-      <w:proofErr w:type="spellStart"/>
-      <w:r>
-        <w:t>Kytherium</w:t>
-      </w:r>
-      <w:proofErr w:type="spellEnd"/>
-      <w:r>
-        <w:t xml:space="preserve">. I might add a spike or tentacle hitting the drone later. </w:t>
-      </w:r>
-    </w:p>
-    <w:p>
-      <w:proofErr w:type="spellStart"/>
-      <w:r>
-        <w:t>Kytherium</w:t>
-      </w:r>
-      <w:proofErr w:type="spellEnd"/>
-      <w:r>
-        <w:t xml:space="preserve"> comes in 4 grades. </w:t>
-      </w:r>
-    </w:p>
-    <w:p>
-      <w:proofErr w:type="spellStart"/>
-      <w:r>
-        <w:t>Vythar</w:t>
-      </w:r>
-      <w:proofErr w:type="spellEnd"/>
-      <w:r>
-        <w:t xml:space="preserve"> = The basic version of </w:t>
-      </w:r>
-      <w:proofErr w:type="spellStart"/>
-      <w:r>
-        <w:t>Kytherium</w:t>
-      </w:r>
-      <w:proofErr w:type="spellEnd"/>
-      <w:r>
-        <w:t xml:space="preserve"> and the least profitable to gather. Prevalent in the </w:t>
-      </w:r>
-      <w:proofErr w:type="spellStart"/>
-      <w:r>
-        <w:t>Emberflow</w:t>
-      </w:r>
-      <w:proofErr w:type="spellEnd"/>
-      <w:r>
-        <w:t xml:space="preserve"> Shallows</w:t>
-      </w:r>
-    </w:p>
-    <w:p>
-      <w:proofErr w:type="spellStart"/>
-      <w:r>
-        <w:t>Kaelar</w:t>
-      </w:r>
-      <w:proofErr w:type="spellEnd"/>
-      <w:r>
-        <w:t xml:space="preserve"> = The </w:t>
-      </w:r>
-      <w:r>
-        <w:t>second-tier</w:t>
-      </w:r>
-      <w:r>
-        <w:t xml:space="preserve"> quality version of </w:t>
-      </w:r>
-      <w:proofErr w:type="spellStart"/>
-      <w:r>
-        <w:t>Kytherium</w:t>
-      </w:r>
-      <w:proofErr w:type="spellEnd"/>
-      <w:r>
-        <w:t xml:space="preserve">. Prevalent in the </w:t>
-      </w:r>
-      <w:proofErr w:type="spellStart"/>
-      <w:r>
-        <w:t>Magmaweave</w:t>
-      </w:r>
-      <w:proofErr w:type="spellEnd"/>
-      <w:r>
-        <w:t xml:space="preserve">. </w:t>
-      </w:r>
-    </w:p>
-    <w:p>
-      <w:r>
-        <w:t>Therion</w:t>
-      </w:r>
-      <w:r>
-        <w:t xml:space="preserve"> = The </w:t>
-      </w:r>
-      <w:r>
-        <w:t>third-tier</w:t>
-      </w:r>
-      <w:r>
-        <w:t xml:space="preserve"> quality version of </w:t>
-      </w:r>
-      <w:proofErr w:type="spellStart"/>
-      <w:r>
-        <w:t>Kytherium</w:t>
-      </w:r>
-      <w:proofErr w:type="spellEnd"/>
-      <w:r>
-        <w:t xml:space="preserve">. Prevalent in the </w:t>
-      </w:r>
-      <w:proofErr w:type="spellStart"/>
-      <w:r>
-        <w:t>Pyroclast</w:t>
-      </w:r>
-      <w:proofErr w:type="spellEnd"/>
-      <w:r>
-        <w:t xml:space="preserve"> Veins</w:t>
-      </w:r>
-      <w:r>
-        <w:t xml:space="preserve">. </w:t>
-      </w:r>
-    </w:p>
-    <w:p>
-      <w:proofErr w:type="spellStart"/>
-      <w:r>
-        <w:t>Atherion</w:t>
-      </w:r>
-      <w:proofErr w:type="spellEnd"/>
-      <w:r>
-        <w:t xml:space="preserve"> = The most valuable version of </w:t>
-      </w:r>
-      <w:proofErr w:type="spellStart"/>
-      <w:r>
-        <w:t>Kytherium</w:t>
-      </w:r>
-      <w:proofErr w:type="spellEnd"/>
-      <w:r>
-        <w:t xml:space="preserve">. Prevalent in the </w:t>
-      </w:r>
-      <w:r>
-        <w:t>Molten</w:t>
-      </w:r>
-      <w:r>
-        <w:t xml:space="preserve"> </w:t>
-      </w:r>
-      <w:r>
-        <w:t>Crucible</w:t>
-      </w:r>
-      <w:r>
-        <w:t xml:space="preserve">. </w:t>
-      </w:r>
-    </w:p>
-    <w:p>
-      <w:pPr>
-        <w:pStyle w:val="Heading2"/>
-      </w:pPr>
-      <w:r>
-        <w:t>Difficulty Settings</w:t>
-      </w:r>
-    </w:p>
-    <w:p>
-      <w:r>
-        <w:t xml:space="preserve">The lower difficulty settings have lower quality </w:t>
-      </w:r>
-      <w:proofErr w:type="spellStart"/>
-      <w:r>
-        <w:t>Kytherium</w:t>
-      </w:r>
-      <w:proofErr w:type="spellEnd"/>
-      <w:r>
-        <w:t xml:space="preserve">. The </w:t>
-      </w:r>
-      <w:r>
-        <w:t xml:space="preserve">higher the difficulty settings, the more competition you have, and the harder you have to work to collect the ore. </w:t>
-      </w:r>
-      <w:r>
-        <w:t>At first, t</w:t>
-      </w:r>
-      <w:r>
-        <w:t>he lowest difficulty just has pipes to dodge. The higher the difficulty</w:t>
-      </w:r>
-      <w:r>
-        <w:t xml:space="preserve"> or the further you progress in the run</w:t>
-      </w:r>
-      <w:r>
-        <w:t>, the more obstacles and more variety of obstacles you have to deal with</w:t>
-      </w:r>
-      <w:r>
-        <w:t xml:space="preserve"> </w:t>
-      </w:r>
-      <w:r>
-        <w:lastRenderedPageBreak/>
-        <w:t>(though initially, there will only be mines added other obstacles will be added in future patches)</w:t>
-      </w:r>
-      <w:r>
-        <w:t xml:space="preserve">. You also get paid more for the ore from the higher difficulties. </w:t>
-      </w:r>
-      <w:r>
-        <w:t xml:space="preserve">The </w:t>
-      </w:r>
-      <w:proofErr w:type="spellStart"/>
-      <w:r>
-        <w:t>Emberflow</w:t>
-      </w:r>
-      <w:proofErr w:type="spellEnd"/>
-      <w:r>
-        <w:t xml:space="preserve"> Shallows</w:t>
-      </w:r>
-      <w:r>
-        <w:t xml:space="preserve">, </w:t>
-      </w:r>
-      <w:proofErr w:type="spellStart"/>
-      <w:r>
-        <w:t>Magmaweave</w:t>
-      </w:r>
-      <w:proofErr w:type="spellEnd"/>
-      <w:r>
-        <w:t xml:space="preserve">, and </w:t>
-      </w:r>
-      <w:proofErr w:type="spellStart"/>
-      <w:r>
-        <w:t>Pyroclast</w:t>
-      </w:r>
-      <w:proofErr w:type="spellEnd"/>
-      <w:r>
-        <w:t xml:space="preserve"> Veins</w:t>
-      </w:r>
-      <w:r>
-        <w:t xml:space="preserve"> are not truly endless. After a certain point in each, you will advance to the next region. The </w:t>
-      </w:r>
-      <w:r>
-        <w:t>Molten</w:t>
-      </w:r>
-      <w:r>
-        <w:t xml:space="preserve"> </w:t>
-      </w:r>
-      <w:r>
-        <w:t>Crucible</w:t>
-      </w:r>
-      <w:r>
-        <w:t xml:space="preserve"> is truly endless, if you start in it, you will continue in that region until your run ends. </w:t>
-      </w:r>
-    </w:p>
-    <w:p>
-      <w:r>
-        <w:t xml:space="preserve">All regions are only guaranteed 1 safe lane, though the higher difficulty settings or the farther you progress in a run you will be more likely to have to deal with more obstacles filling more lanes. </w:t>
-      </w:r>
-    </w:p>
-    <w:p>
-      <w:proofErr w:type="spellStart"/>
-      <w:r>
-        <w:t>Emberflow</w:t>
-      </w:r>
-      <w:proofErr w:type="spellEnd"/>
-      <w:r>
-        <w:t xml:space="preserve"> Shallows</w:t>
-      </w:r>
-      <w:r>
-        <w:t xml:space="preserve"> = Easy</w:t>
-      </w:r>
-      <w:r>
-        <w:t xml:space="preserve">. </w:t>
-      </w:r>
-      <w:r>
-        <w:t>Ore value and drop rates and obstacle spawn rates x1</w:t>
-      </w:r>
-      <w:r>
-        <w:t xml:space="preserve">. </w:t>
-      </w:r>
-    </w:p>
-    <w:p>
-      <w:r>
-        <w:t xml:space="preserve">For ore drops, 70% will be </w:t>
-      </w:r>
-      <w:r>
-        <w:t>Vythar</w:t>
-      </w:r>
-      <w:r>
-        <w:t xml:space="preserve">, 15% will be </w:t>
-      </w:r>
-      <w:proofErr w:type="spellStart"/>
-      <w:r>
-        <w:t>Kaelar</w:t>
-      </w:r>
-      <w:proofErr w:type="spellEnd"/>
-      <w:r>
-        <w:t xml:space="preserve">, 10% will be </w:t>
-      </w:r>
-      <w:r>
-        <w:t>Therion</w:t>
-      </w:r>
-      <w:r>
-        <w:t xml:space="preserve">, and 5% will be </w:t>
-      </w:r>
-      <w:proofErr w:type="spellStart"/>
-      <w:r>
-        <w:t>Atherion</w:t>
-      </w:r>
-      <w:proofErr w:type="spellEnd"/>
-      <w:r>
-        <w:t xml:space="preserve">. </w:t>
-      </w:r>
-    </w:p>
-    <w:p>
-      <w:proofErr w:type="spellStart"/>
-      <w:r>
-        <w:t>Magmaweave</w:t>
-      </w:r>
-      <w:proofErr w:type="spellEnd"/>
-      <w:r>
-        <w:t xml:space="preserve"> = Medium</w:t>
-      </w:r>
-      <w:r>
-        <w:t>.</w:t>
-      </w:r>
-      <w:r>
-        <w:t xml:space="preserve"> </w:t>
-      </w:r>
-      <w:r>
-        <w:t xml:space="preserve"> </w:t>
-      </w:r>
-      <w:r>
-        <w:t>Ore value and drop rates and obstacle spawn rates x2 (subject to change). Additional object types will be added to account for increased obstacle spawn rate.</w:t>
-      </w:r>
-      <w:r>
-        <w:t xml:space="preserve"> </w:t>
-      </w:r>
-    </w:p>
-    <w:p>
-      <w:r>
-        <w:t xml:space="preserve">For ore drops, 70% will be </w:t>
-      </w:r>
-      <w:proofErr w:type="spellStart"/>
-      <w:r>
-        <w:t>Kaelar</w:t>
-      </w:r>
-      <w:proofErr w:type="spellEnd"/>
-      <w:r>
-        <w:t xml:space="preserve">, 15% will be </w:t>
-      </w:r>
-      <w:r>
-        <w:t>Vythar</w:t>
-      </w:r>
-      <w:r>
-        <w:t xml:space="preserve">, 10% will be </w:t>
-      </w:r>
-      <w:r>
-        <w:t>Therion</w:t>
-      </w:r>
-      <w:r>
-        <w:t xml:space="preserve">, and 5% will be </w:t>
-      </w:r>
-      <w:proofErr w:type="spellStart"/>
-      <w:r>
-        <w:t>Atherion</w:t>
-      </w:r>
-      <w:proofErr w:type="spellEnd"/>
-      <w:r>
-        <w:t xml:space="preserve">. </w:t>
-      </w:r>
-    </w:p>
-    <w:p/>
-    <w:p>
-      <w:proofErr w:type="spellStart"/>
-      <w:r>
-        <w:t>Pyroclast</w:t>
-      </w:r>
-      <w:proofErr w:type="spellEnd"/>
-      <w:r>
-        <w:t xml:space="preserve"> Veins</w:t>
-      </w:r>
-      <w:r>
-        <w:t xml:space="preserve"> = Hard</w:t>
-      </w:r>
-      <w:r>
-        <w:t>. Ore value and drop rates and obstacle spawn rates x3 (subject to change). Additional object types will be added to account for increased obstacle spawn rate.</w:t>
-      </w:r>
-      <w:r>
-        <w:t xml:space="preserve"> </w:t>
-      </w:r>
-    </w:p>
-    <w:p>
-      <w:r>
-        <w:t xml:space="preserve">For ore drops, 70% will be </w:t>
-      </w:r>
-      <w:r>
-        <w:t>Therion</w:t>
-      </w:r>
-      <w:r>
-        <w:t xml:space="preserve">, 15% will be </w:t>
-      </w:r>
-      <w:proofErr w:type="spellStart"/>
-      <w:r>
-        <w:t>Kaelar</w:t>
-      </w:r>
-      <w:proofErr w:type="spellEnd"/>
-      <w:r>
-        <w:t>, 10% will be</w:t>
-      </w:r>
-      <w:r>
-        <w:t xml:space="preserve"> </w:t>
-      </w:r>
-      <w:r>
-        <w:t>Vythar</w:t>
-      </w:r>
-      <w:r>
-        <w:t xml:space="preserve">, and 5% will be </w:t>
-      </w:r>
-      <w:proofErr w:type="spellStart"/>
-      <w:r>
-        <w:t>Atherion</w:t>
-      </w:r>
-      <w:proofErr w:type="spellEnd"/>
-      <w:r>
-        <w:t xml:space="preserve">. </w:t>
-      </w:r>
-    </w:p>
-    <w:p/>
-    <w:p>
-      <w:r>
-        <w:t>Molten</w:t>
-      </w:r>
-      <w:r>
-        <w:t xml:space="preserve"> </w:t>
-      </w:r>
-      <w:r>
-        <w:t>Crucible</w:t>
-      </w:r>
-      <w:r>
-        <w:t xml:space="preserve"> = Veteran</w:t>
-      </w:r>
-      <w:r>
-        <w:t xml:space="preserve">. </w:t>
-      </w:r>
-      <w:r>
-        <w:t>Ore value and drop rates and obstacle spawn rates x4 (subject to change). Additional object types will be added to account for increased obstacle spawn rate.</w:t>
-      </w:r>
-      <w:r>
-        <w:t xml:space="preserve"> </w:t>
-      </w:r>
-    </w:p>
-    <w:p>
-      <w:r>
         <w:t xml:space="preserve">For ore drops, 70% will be </w:t>
       </w:r>
       <w:proofErr w:type="spellStart"/>
@@ -1332,7 +1353,6 @@
         <w:pStyle w:val="Heading2"/>
       </w:pPr>
       <w:r>
-        <w:lastRenderedPageBreak/>
         <w:t>Main Menu Design:</w:t>
       </w:r>
     </w:p>
@@ -1465,6 +1485,7 @@
         </w:numPr>
       </w:pPr>
       <w:r>
+        <w:lastRenderedPageBreak/>
         <w:t xml:space="preserve">1,000 </w:t>
       </w:r>
       <w:proofErr w:type="spellStart"/>
@@ -1550,280 +1571,280 @@
     </w:p>
     <w:p>
       <w:r>
+        <w:t xml:space="preserve">They cannot turn in an incomplete order. They must first collect all </w:t>
+      </w:r>
+      <w:proofErr w:type="spellStart"/>
+      <w:r>
+        <w:t>Kytherium</w:t>
+      </w:r>
+      <w:proofErr w:type="spellEnd"/>
+      <w:r>
+        <w:t xml:space="preserve"> before they can turn in. </w:t>
+      </w:r>
+      <w:r>
+        <w:t xml:space="preserve">If </w:t>
+      </w:r>
+      <w:r>
+        <w:t xml:space="preserve">player is </w:t>
+      </w:r>
+      <w:r>
+        <w:t xml:space="preserve">late delivering the </w:t>
+      </w:r>
+      <w:r>
+        <w:t xml:space="preserve">agreed upon quantity of </w:t>
+      </w:r>
+      <w:proofErr w:type="spellStart"/>
+      <w:r>
+        <w:t>Kytherium</w:t>
+      </w:r>
+      <w:proofErr w:type="spellEnd"/>
+      <w:r>
+        <w:t xml:space="preserve">, a 25% penalty will be applied to </w:t>
+      </w:r>
+      <w:r>
+        <w:t>the</w:t>
+      </w:r>
+      <w:r>
+        <w:t xml:space="preserve"> pay. If </w:t>
+      </w:r>
+      <w:r>
+        <w:t>they</w:t>
+      </w:r>
+      <w:r>
+        <w:t xml:space="preserve"> are late by more than twice the agreed upon amount of time, </w:t>
+      </w:r>
+      <w:r>
+        <w:t>the</w:t>
+      </w:r>
+      <w:r>
+        <w:t xml:space="preserve"> penalty will be increased to 100% meaning they will take the </w:t>
+      </w:r>
+      <w:proofErr w:type="spellStart"/>
+      <w:r>
+        <w:t>Kytherium</w:t>
+      </w:r>
+      <w:proofErr w:type="spellEnd"/>
+      <w:r>
+        <w:t xml:space="preserve"> but </w:t>
+      </w:r>
+      <w:r>
+        <w:t>they</w:t>
+      </w:r>
+      <w:r>
+        <w:t xml:space="preserve"> will not be paid. </w:t>
+      </w:r>
+      <w:r>
+        <w:t xml:space="preserve">No new contracts can be accepted until you have turned in the current contract. Only one contract can be accepted at any time. </w:t>
+      </w:r>
+    </w:p>
+    <w:p>
+      <w:r>
+        <w:t>The player</w:t>
+      </w:r>
+      <w:r>
+        <w:t xml:space="preserve"> cannot pre-collect </w:t>
+      </w:r>
+      <w:proofErr w:type="spellStart"/>
+      <w:r>
+        <w:t>Kytherium</w:t>
+      </w:r>
+      <w:proofErr w:type="spellEnd"/>
+      <w:r>
+        <w:t xml:space="preserve"> before taking a new contract. If </w:t>
+      </w:r>
+      <w:r>
+        <w:t>they</w:t>
+      </w:r>
+      <w:r>
+        <w:t xml:space="preserve"> have already collected </w:t>
+      </w:r>
+      <w:proofErr w:type="spellStart"/>
+      <w:r>
+        <w:t>Kytherium</w:t>
+      </w:r>
+      <w:proofErr w:type="spellEnd"/>
+      <w:r>
+        <w:t xml:space="preserve"> and go into the Contracts menu, </w:t>
+      </w:r>
+      <w:r>
+        <w:t>they</w:t>
+      </w:r>
+      <w:r>
+        <w:t xml:space="preserve"> will need to sell the </w:t>
+      </w:r>
+      <w:proofErr w:type="spellStart"/>
+      <w:r>
+        <w:t>Kytherium</w:t>
+      </w:r>
+      <w:proofErr w:type="spellEnd"/>
+      <w:r>
+        <w:t xml:space="preserve"> </w:t>
+      </w:r>
+      <w:r>
+        <w:t>they</w:t>
+      </w:r>
+      <w:r>
+        <w:t xml:space="preserve"> already have before </w:t>
+      </w:r>
+      <w:r>
+        <w:t>they</w:t>
+      </w:r>
+      <w:r>
+        <w:t xml:space="preserve"> can accept a contract. Without a contract, </w:t>
+      </w:r>
+      <w:proofErr w:type="spellStart"/>
+      <w:r>
+        <w:t>Kytherium</w:t>
+      </w:r>
+      <w:proofErr w:type="spellEnd"/>
+      <w:r>
+        <w:t xml:space="preserve"> is sold at a flat rate of 50 </w:t>
+      </w:r>
+      <w:proofErr w:type="spellStart"/>
+      <w:r>
+        <w:t>Derrenni</w:t>
+      </w:r>
+      <w:proofErr w:type="spellEnd"/>
+      <w:r>
+        <w:t xml:space="preserve"> regardless of quality. </w:t>
+      </w:r>
+    </w:p>
+    <w:p>
+      <w:r>
+        <w:t>Penalty modifier can be 1, 0.75, or 0</w:t>
+      </w:r>
+    </w:p>
+    <w:p>
+      <w:pPr>
+        <w:pStyle w:val="Heading2"/>
+      </w:pPr>
+      <w:r>
+        <w:t xml:space="preserve">Run Structure and Progression  </w:t>
+      </w:r>
+    </w:p>
+    <w:p>
+      <w:r>
+        <w:t xml:space="preserve">Starting Speed: To be determined based on what feels fun. </w:t>
+      </w:r>
+    </w:p>
+    <w:p>
+      <w:r>
+        <w:t>Max Speed: To be determined based on what feels fun</w:t>
+      </w:r>
+      <w:r>
+        <w:t xml:space="preserve"> and playable</w:t>
+      </w:r>
+      <w:r>
+        <w:t xml:space="preserve">. </w:t>
+      </w:r>
+    </w:p>
+    <w:p>
+      <w:r>
+        <w:t xml:space="preserve">Acceleration: To be determined based on what feels fun. </w:t>
+      </w:r>
+      <w:r>
+        <w:t xml:space="preserve">Each time you tag a </w:t>
+      </w:r>
+      <w:proofErr w:type="spellStart"/>
+      <w:r>
+        <w:t>Kytherium</w:t>
+      </w:r>
+      <w:proofErr w:type="spellEnd"/>
+      <w:r>
+        <w:t xml:space="preserve"> deposit, your drone will permanently accelerate going into a sort of forced over</w:t>
+      </w:r>
+      <w:r>
+        <w:t>-</w:t>
+      </w:r>
+      <w:r>
+        <w:t xml:space="preserve">clock caused by the effects of being in contact with unrefined </w:t>
+      </w:r>
+      <w:proofErr w:type="spellStart"/>
+      <w:r>
+        <w:t>Kytherium</w:t>
+      </w:r>
+      <w:proofErr w:type="spellEnd"/>
+      <w:r>
+        <w:t xml:space="preserve">. </w:t>
+      </w:r>
+    </w:p>
+    <w:p>
+      <w:proofErr w:type="spellStart"/>
+      <w:r>
+        <w:t>Kytherium</w:t>
+      </w:r>
+      <w:proofErr w:type="spellEnd"/>
+      <w:r>
+        <w:t xml:space="preserve"> Drop rate: To be determined based on what feels fun and will be higher in the higher difficulties. </w:t>
+      </w:r>
+    </w:p>
+    <w:p>
+      <w:r>
+        <w:t xml:space="preserve">Drone Cost: </w:t>
+      </w:r>
+      <w:r>
+        <w:t xml:space="preserve">1000 </w:t>
+      </w:r>
+      <w:proofErr w:type="spellStart"/>
+      <w:r>
+        <w:t>Derenni</w:t>
+      </w:r>
+      <w:proofErr w:type="spellEnd"/>
+      <w:r>
+        <w:t xml:space="preserve">. </w:t>
+      </w:r>
+    </w:p>
+    <w:p>
+      <w:r>
+        <w:t>As this is supposed to represent real machinery installed on a real planet, no region is truly endless. Instead when you reach the end of one section, you move into the next.</w:t>
+      </w:r>
+      <w:r>
+        <w:t xml:space="preserve"> For example, after the player gets to the end of the </w:t>
+      </w:r>
+      <w:proofErr w:type="spellStart"/>
+      <w:r>
+        <w:t>Emberflow</w:t>
+      </w:r>
+      <w:proofErr w:type="spellEnd"/>
+      <w:r>
+        <w:t xml:space="preserve"> Shallows, they will move into the </w:t>
+      </w:r>
+      <w:proofErr w:type="spellStart"/>
+      <w:r>
+        <w:t>Magmaweave</w:t>
+      </w:r>
+      <w:proofErr w:type="spellEnd"/>
+      <w:r>
+        <w:t xml:space="preserve">. There will be a visual prompt on screen telling the player they are moving to a new region. </w:t>
+      </w:r>
+      <w:r>
+        <w:t xml:space="preserve">When you reach the end of the Molten Crucible, you move into the Ember Flow Shallows. And while the ore spawn types will change based on the new region, the difficulty will not change. It will continue to escalate higher and higher the farther you progress. </w:t>
+      </w:r>
+      <w:r>
+        <w:t xml:space="preserve">Right now (unless I think of a different way to do this) I am thinking of having it triggered based on the number of ore samples that have been spawned. </w:t>
+      </w:r>
+    </w:p>
+    <w:p>
+      <w:proofErr w:type="spellStart"/>
+      <w:r>
         <w:lastRenderedPageBreak/>
-        <w:t xml:space="preserve">They cannot turn in an incomplete order. They must first collect all </w:t>
-      </w:r>
-      <w:proofErr w:type="spellStart"/>
-      <w:r>
-        <w:t>Kytherium</w:t>
-      </w:r>
-      <w:proofErr w:type="spellEnd"/>
-      <w:r>
-        <w:t xml:space="preserve"> before they can turn in. </w:t>
-      </w:r>
-      <w:r>
-        <w:t xml:space="preserve">If </w:t>
-      </w:r>
-      <w:r>
-        <w:t xml:space="preserve">player is </w:t>
-      </w:r>
-      <w:r>
-        <w:t xml:space="preserve">late delivering the </w:t>
-      </w:r>
-      <w:r>
-        <w:t xml:space="preserve">agreed upon quantity of </w:t>
-      </w:r>
-      <w:proofErr w:type="spellStart"/>
-      <w:r>
-        <w:t>Kytherium</w:t>
-      </w:r>
-      <w:proofErr w:type="spellEnd"/>
-      <w:r>
-        <w:t xml:space="preserve">, a 25% penalty will be applied to </w:t>
-      </w:r>
-      <w:r>
-        <w:t>the</w:t>
-      </w:r>
-      <w:r>
-        <w:t xml:space="preserve"> pay. If </w:t>
-      </w:r>
-      <w:r>
-        <w:t>they</w:t>
-      </w:r>
-      <w:r>
-        <w:t xml:space="preserve"> are late by more than twice the agreed upon amount of time, </w:t>
-      </w:r>
-      <w:r>
-        <w:t>the</w:t>
-      </w:r>
-      <w:r>
-        <w:t xml:space="preserve"> penalty will be increased to 100% meaning they will take the </w:t>
-      </w:r>
-      <w:proofErr w:type="spellStart"/>
-      <w:r>
-        <w:t>Kytherium</w:t>
-      </w:r>
-      <w:proofErr w:type="spellEnd"/>
-      <w:r>
-        <w:t xml:space="preserve"> but </w:t>
-      </w:r>
-      <w:r>
-        <w:t>they</w:t>
-      </w:r>
-      <w:r>
-        <w:t xml:space="preserve"> will not be paid. </w:t>
-      </w:r>
-      <w:r>
-        <w:t xml:space="preserve">No new contracts can be accepted until you have turned in the current contract. Only one contract can be accepted at any time. </w:t>
-      </w:r>
-    </w:p>
-    <w:p>
-      <w:r>
-        <w:t>The player</w:t>
-      </w:r>
-      <w:r>
-        <w:t xml:space="preserve"> cannot pre-collect </w:t>
-      </w:r>
-      <w:proofErr w:type="spellStart"/>
-      <w:r>
-        <w:t>Kytherium</w:t>
-      </w:r>
-      <w:proofErr w:type="spellEnd"/>
-      <w:r>
-        <w:t xml:space="preserve"> before taking a new contract. If </w:t>
-      </w:r>
-      <w:r>
-        <w:t>they</w:t>
-      </w:r>
-      <w:r>
-        <w:t xml:space="preserve"> have already collected </w:t>
-      </w:r>
-      <w:proofErr w:type="spellStart"/>
-      <w:r>
-        <w:t>Kytherium</w:t>
-      </w:r>
-      <w:proofErr w:type="spellEnd"/>
-      <w:r>
-        <w:t xml:space="preserve"> and go into the Contracts menu, </w:t>
-      </w:r>
-      <w:r>
-        <w:t>they</w:t>
-      </w:r>
-      <w:r>
-        <w:t xml:space="preserve"> will need to sell the </w:t>
-      </w:r>
-      <w:proofErr w:type="spellStart"/>
-      <w:r>
-        <w:t>Kytherium</w:t>
-      </w:r>
-      <w:proofErr w:type="spellEnd"/>
-      <w:r>
-        <w:t xml:space="preserve"> </w:t>
-      </w:r>
-      <w:r>
-        <w:t>they</w:t>
-      </w:r>
-      <w:r>
-        <w:t xml:space="preserve"> already have before </w:t>
-      </w:r>
-      <w:r>
-        <w:t>they</w:t>
-      </w:r>
-      <w:r>
-        <w:t xml:space="preserve"> can accept a contract. Without a contract, </w:t>
-      </w:r>
-      <w:proofErr w:type="spellStart"/>
-      <w:r>
-        <w:t>Kytherium</w:t>
-      </w:r>
-      <w:proofErr w:type="spellEnd"/>
-      <w:r>
-        <w:t xml:space="preserve"> is sold at a flat rate of 50 </w:t>
-      </w:r>
-      <w:proofErr w:type="spellStart"/>
-      <w:r>
-        <w:t>Derrenni</w:t>
-      </w:r>
-      <w:proofErr w:type="spellEnd"/>
-      <w:r>
-        <w:t xml:space="preserve"> regardless of quality. </w:t>
-      </w:r>
-    </w:p>
-    <w:p>
-      <w:r>
-        <w:t>Penalty modifier can be 1, 0.75, or 0</w:t>
-      </w:r>
-    </w:p>
-    <w:p>
-      <w:pPr>
-        <w:pStyle w:val="Heading2"/>
-      </w:pPr>
-      <w:r>
-        <w:t xml:space="preserve">Run Structure and Progression  </w:t>
-      </w:r>
-    </w:p>
-    <w:p>
-      <w:r>
-        <w:t xml:space="preserve">Starting Speed: To be determined based on what feels fun. </w:t>
-      </w:r>
-    </w:p>
-    <w:p>
-      <w:r>
-        <w:t>Max Speed: To be determined based on what feels fun</w:t>
-      </w:r>
-      <w:r>
-        <w:t xml:space="preserve"> and playable</w:t>
-      </w:r>
-      <w:r>
-        <w:t xml:space="preserve">. </w:t>
-      </w:r>
-    </w:p>
-    <w:p>
-      <w:r>
-        <w:t xml:space="preserve">Acceleration: To be determined based on what feels fun. </w:t>
-      </w:r>
-      <w:r>
-        <w:t xml:space="preserve">Each time you tag a </w:t>
-      </w:r>
-      <w:proofErr w:type="spellStart"/>
-      <w:r>
-        <w:t>Kytherium</w:t>
-      </w:r>
-      <w:proofErr w:type="spellEnd"/>
-      <w:r>
-        <w:t xml:space="preserve"> deposit, your drone will permanently accelerate going into a sort of forced over</w:t>
-      </w:r>
-      <w:r>
-        <w:t>-</w:t>
-      </w:r>
-      <w:r>
-        <w:t xml:space="preserve">clock caused by the effects of being in contact with unrefined </w:t>
-      </w:r>
-      <w:proofErr w:type="spellStart"/>
-      <w:r>
-        <w:t>Kytherium</w:t>
-      </w:r>
-      <w:proofErr w:type="spellEnd"/>
-      <w:r>
-        <w:t xml:space="preserve">. </w:t>
-      </w:r>
-    </w:p>
-    <w:p>
-      <w:proofErr w:type="spellStart"/>
-      <w:r>
-        <w:t>Kytherium</w:t>
-      </w:r>
-      <w:proofErr w:type="spellEnd"/>
-      <w:r>
-        <w:t xml:space="preserve"> Drop rate: To be determined based on what feels fun and will be higher in the higher difficulties. </w:t>
-      </w:r>
-    </w:p>
-    <w:p>
-      <w:r>
-        <w:t xml:space="preserve">Drone Cost: </w:t>
-      </w:r>
-      <w:r>
-        <w:t xml:space="preserve">1000 </w:t>
-      </w:r>
-      <w:proofErr w:type="spellStart"/>
-      <w:r>
-        <w:t>Derenni</w:t>
-      </w:r>
-      <w:proofErr w:type="spellEnd"/>
-      <w:r>
-        <w:t xml:space="preserve">. </w:t>
-      </w:r>
-    </w:p>
-    <w:p>
-      <w:r>
-        <w:t>As this is supposed to represent real machinery installed on a real planet, no region is truly endless. Instead when you reach the end of one section, you move into the next.</w:t>
-      </w:r>
-      <w:r>
-        <w:t xml:space="preserve"> For example, after the player gets to the end of the </w:t>
-      </w:r>
-      <w:proofErr w:type="spellStart"/>
-      <w:r>
         <w:t>Emberflow</w:t>
       </w:r>
       <w:proofErr w:type="spellEnd"/>
       <w:r>
-        <w:t xml:space="preserve"> Shallows, they will move into the </w:t>
-      </w:r>
+        <w:t xml:space="preserve"> Shallows</w:t>
+      </w:r>
+      <w:r>
+        <w:t>: Ends after 100 Ore Samples have been spawned</w:t>
+      </w:r>
+    </w:p>
+    <w:p>
       <w:proofErr w:type="spellStart"/>
       <w:r>
         <w:t>Magmaweave</w:t>
       </w:r>
       <w:proofErr w:type="spellEnd"/>
       <w:r>
-        <w:t xml:space="preserve">. There will be a visual prompt on screen telling the player they are moving to a new region. </w:t>
-      </w:r>
-      <w:r>
-        <w:t xml:space="preserve">When you reach the end of the Molten Crucible, you move into the Ember Flow Shallows. And while the ore spawn types will change based on the new region, the difficulty will not change. It will continue to escalate higher and higher the farther you progress. </w:t>
-      </w:r>
-      <w:r>
-        <w:t xml:space="preserve">Right now (unless I think of a different way to do this) I am thinking of having it triggered based on the number of ore samples that have been spawned. </w:t>
-      </w:r>
-    </w:p>
-    <w:p>
-      <w:proofErr w:type="spellStart"/>
-      <w:r>
-        <w:t>Emberflow</w:t>
-      </w:r>
-      <w:proofErr w:type="spellEnd"/>
-      <w:r>
-        <w:t xml:space="preserve"> Shallows</w:t>
-      </w:r>
-      <w:r>
-        <w:t>: Ends after 100 Ore Samples have been spawned</w:t>
-      </w:r>
-    </w:p>
-    <w:p>
-      <w:proofErr w:type="spellStart"/>
-      <w:r>
-        <w:t>Magmaweave</w:t>
-      </w:r>
-      <w:proofErr w:type="spellEnd"/>
-      <w:r>
         <w:t>: Ends after 200 Ore Samples have been spawned</w:t>
       </w:r>
     </w:p>
@@ -1842,7 +1863,6 @@
     </w:p>
     <w:p>
       <w:r>
-        <w:lastRenderedPageBreak/>
         <w:t>Molten</w:t>
       </w:r>
       <w:r>
@@ -2045,6 +2065,7 @@
     </w:p>
     <w:p>
       <w:r>
+        <w:lastRenderedPageBreak/>
         <w:t xml:space="preserve">If you crash into a pipe you lose nothing but the drone. If any other obstacle type ends your run, then you will lose a small amount of </w:t>
       </w:r>
       <w:proofErr w:type="spellStart"/>
@@ -2074,7 +2095,6 @@
         <w:pStyle w:val="Heading2"/>
       </w:pPr>
       <w:r>
-        <w:lastRenderedPageBreak/>
         <w:t>Laser Mechanics</w:t>
       </w:r>
     </w:p>
@@ -2286,6 +2306,7 @@
       </w:pPr>
       <w:proofErr w:type="spellStart"/>
       <w:r>
+        <w:lastRenderedPageBreak/>
         <w:t>Atherion</w:t>
       </w:r>
       <w:proofErr w:type="spellEnd"/>
@@ -2351,7 +2372,6 @@
         </w:numPr>
       </w:pPr>
       <w:r>
-        <w:lastRenderedPageBreak/>
         <w:t>Subtract any lost ore from total ore collected this run and adjust ore totals</w:t>
       </w:r>
     </w:p>
@@ -2707,6 +2727,7 @@
         </w:numPr>
       </w:pPr>
       <w:r>
+        <w:lastRenderedPageBreak/>
         <w:t>Add current contract total expenses</w:t>
       </w:r>
       <w:r>
@@ -2741,7 +2762,6 @@
         <w:pStyle w:val="Heading2"/>
       </w:pPr>
       <w:r>
-        <w:lastRenderedPageBreak/>
         <w:t xml:space="preserve">Obstacle Types and Behaviors  </w:t>
       </w:r>
     </w:p>
@@ -3028,6 +3048,7 @@
         </w:numPr>
       </w:pPr>
       <w:r>
+        <w:lastRenderedPageBreak/>
         <w:t xml:space="preserve">Check for </w:t>
       </w:r>
       <w:r>
@@ -3106,7 +3127,6 @@
         </w:numPr>
       </w:pPr>
       <w:r>
-        <w:lastRenderedPageBreak/>
         <w:t xml:space="preserve">Check </w:t>
       </w:r>
       <w:proofErr w:type="spellStart"/>
@@ -3231,18 +3251,244 @@
     </w:p>
     <w:p>
       <w:r>
+        <w:t>Siphon Pylon</w:t>
+      </w:r>
+    </w:p>
+    <w:p>
+      <w:r>
+        <w:t>Dragnet</w:t>
+      </w:r>
+    </w:p>
+    <w:p>
+      <w:r>
+        <w:t>Mimic Core</w:t>
+      </w:r>
+    </w:p>
+    <w:p>
+      <w:pPr>
+        <w:pStyle w:val="Heading2"/>
+      </w:pPr>
+      <w:r>
+        <w:t xml:space="preserve">HUD During Gameplay  </w:t>
+      </w:r>
+    </w:p>
+    <w:p>
+      <w:r>
+        <w:t>I want a thin border around the edge of the screen that will have the various UI elements displayed to the player. The goal will be to make it look and feel like the screen the Inferno Jockey is looking at while piloting the drone.</w:t>
+      </w:r>
+    </w:p>
+    <w:p>
+      <w:r>
+        <w:t>Starting in the upper right corner t</w:t>
+      </w:r>
+      <w:r>
+        <w:t xml:space="preserve">here will be one slot in the UI for each type of </w:t>
+      </w:r>
+      <w:proofErr w:type="spellStart"/>
+      <w:r>
+        <w:t>Kytherium</w:t>
+      </w:r>
+      <w:proofErr w:type="spellEnd"/>
+      <w:r>
+        <w:t xml:space="preserve">, a slot for how many they still need to collect to fulfill their contract. If no contract is selected, there will be a warning telling them they should get a contract. There will also be a spot showing the amount of time they have left to turn in their contract. </w:t>
+      </w:r>
+    </w:p>
+    <w:p>
+      <w:r>
+        <w:t xml:space="preserve">Finally, there will be a detonate drone button letting them end the run. If they haven’t tagged any </w:t>
+      </w:r>
+      <w:proofErr w:type="spellStart"/>
+      <w:r>
+        <w:t>Kytherium</w:t>
+      </w:r>
+      <w:proofErr w:type="spellEnd"/>
+      <w:r>
+        <w:t xml:space="preserve"> yet, it will be a recall drone button. Below that, they will have the play screen which will have a view of the drone camera, and a grid showing the 6 lanes (3 on the top half of the screen, and 3 on the bottom half of the screen)</w:t>
+      </w:r>
+      <w:r>
+        <w:t>.</w:t>
+      </w:r>
+    </w:p>
+    <w:p>
+      <w:r>
+        <w:t xml:space="preserve">If I have time, the main menu will have the option to customize both what data is shown on the information bar at the top of the screen and where it is placed. </w:t>
+      </w:r>
+    </w:p>
+    <w:p>
+      <w:pPr>
+        <w:pStyle w:val="Heading2"/>
+      </w:pPr>
+      <w:r>
+        <w:t xml:space="preserve">Post-Run Screens  </w:t>
+      </w:r>
+    </w:p>
+    <w:p>
+      <w:r>
+        <w:t xml:space="preserve">Bare bones (will build this first and expand later if I have time): Will be shown in a simple pop-up over the play screen. </w:t>
+      </w:r>
+    </w:p>
+    <w:p>
+      <w:r>
+        <w:t xml:space="preserve">Ideal, the screen will shift, as though the Inferno Jockey switched which screen they were looking at and went to look at a report of the run. </w:t>
+      </w:r>
+    </w:p>
+    <w:p>
+      <w:r>
+        <w:t xml:space="preserve">Both will have the same data on it. One will just look fancier. </w:t>
+      </w:r>
+    </w:p>
+    <w:p>
+      <w:r>
+        <w:t>Data shown</w:t>
+      </w:r>
+    </w:p>
+    <w:p>
+      <w:r>
+        <w:t xml:space="preserve">Amount of </w:t>
+      </w:r>
+      <w:proofErr w:type="spellStart"/>
+      <w:r>
+        <w:t>Kytherium</w:t>
+      </w:r>
+      <w:proofErr w:type="spellEnd"/>
+      <w:r>
+        <w:t xml:space="preserve"> needed to fulfil the current contract. </w:t>
+      </w:r>
+    </w:p>
+    <w:p>
+      <w:r>
+        <w:t xml:space="preserve">Payout of current rate of contract for each type of </w:t>
+      </w:r>
+      <w:proofErr w:type="spellStart"/>
+      <w:r>
+        <w:t>Kytherium</w:t>
+      </w:r>
+      <w:proofErr w:type="spellEnd"/>
+      <w:r>
+        <w:t xml:space="preserve"> </w:t>
+      </w:r>
+    </w:p>
+    <w:p>
+      <w:r>
         <w:lastRenderedPageBreak/>
-        <w:t>Siphon Pylon</w:t>
-      </w:r>
-    </w:p>
-    <w:p>
-      <w:r>
-        <w:t>Dragnet</w:t>
-      </w:r>
-    </w:p>
-    <w:p>
-      <w:r>
-        <w:t>Mimic Core</w:t>
+        <w:t xml:space="preserve">Total </w:t>
+      </w:r>
+      <w:proofErr w:type="spellStart"/>
+      <w:r>
+        <w:t>Kytherium</w:t>
+      </w:r>
+      <w:proofErr w:type="spellEnd"/>
+      <w:r>
+        <w:t xml:space="preserve"> collected of each type since the last contract and the total of all ore combined</w:t>
+      </w:r>
+      <w:r>
+        <w:t xml:space="preserve"> and the estimated payout of each type of </w:t>
+      </w:r>
+      <w:proofErr w:type="spellStart"/>
+      <w:r>
+        <w:t>Kytherium</w:t>
+      </w:r>
+      <w:proofErr w:type="spellEnd"/>
+      <w:r>
+        <w:t xml:space="preserve">. </w:t>
+      </w:r>
+    </w:p>
+    <w:p>
+      <w:r>
+        <w:t xml:space="preserve">Amount of </w:t>
+      </w:r>
+      <w:proofErr w:type="spellStart"/>
+      <w:r>
+        <w:t>Kytherium</w:t>
+      </w:r>
+      <w:proofErr w:type="spellEnd"/>
+      <w:r>
+        <w:t xml:space="preserve"> collected</w:t>
+      </w:r>
+      <w:r>
+        <w:t xml:space="preserve"> from this run</w:t>
+      </w:r>
+      <w:r>
+        <w:t xml:space="preserve"> broken down by type, with total payout from each type. </w:t>
+      </w:r>
+    </w:p>
+    <w:p>
+      <w:r>
+        <w:t xml:space="preserve">(If applicable) </w:t>
+      </w:r>
+      <w:r>
+        <w:t>T</w:t>
+      </w:r>
+      <w:r>
+        <w:t xml:space="preserve">he amount and type of </w:t>
+      </w:r>
+      <w:proofErr w:type="spellStart"/>
+      <w:r>
+        <w:t>Kytherium</w:t>
+      </w:r>
+      <w:proofErr w:type="spellEnd"/>
+      <w:r>
+        <w:t xml:space="preserve"> lost to pirates</w:t>
+      </w:r>
+      <w:r>
+        <w:t xml:space="preserve"> and its total losses</w:t>
+      </w:r>
+      <w:r>
+        <w:t xml:space="preserve">. </w:t>
+      </w:r>
+    </w:p>
+    <w:p>
+      <w:r>
+        <w:t>Total fuel tanks dropped and the total cost of fuel for the run</w:t>
+      </w:r>
+    </w:p>
+    <w:p>
+      <w:r>
+        <w:t>Total fuel tanks collected</w:t>
+      </w:r>
+    </w:p>
+    <w:p>
+      <w:r>
+        <w:t>Total uncollected fuel tanks and their total cost</w:t>
+      </w:r>
+    </w:p>
+    <w:p>
+      <w:r>
+        <w:t>Total laser cores dropped</w:t>
+      </w:r>
+      <w:r>
+        <w:t xml:space="preserve"> </w:t>
+      </w:r>
+      <w:r>
+        <w:t>and the total cost of laser cores for the run</w:t>
+      </w:r>
+    </w:p>
+    <w:p>
+      <w:r>
+        <w:t>Total laser cores collected</w:t>
+      </w:r>
+    </w:p>
+    <w:p>
+      <w:r>
+        <w:t>Total uncollected laser cores and their cost</w:t>
+      </w:r>
+    </w:p>
+    <w:p>
+      <w:r>
+        <w:t xml:space="preserve">(only to be added if I have time) </w:t>
+      </w:r>
+    </w:p>
+    <w:p>
+      <w:r>
+        <w:t xml:space="preserve">Possible change to drop rate of fuel and laser cores for better control of costs. </w:t>
+      </w:r>
+    </w:p>
+    <w:p>
+      <w:r>
+        <w:t xml:space="preserve">Chart showing fuel and laser core </w:t>
+      </w:r>
+      <w:r>
+        <w:t>usage throughout the run. (Will store only the info for the last run for each region)</w:t>
       </w:r>
     </w:p>
     <w:p>
@@ -3250,226 +3496,81 @@
         <w:pStyle w:val="Heading2"/>
       </w:pPr>
       <w:r>
-        <w:t xml:space="preserve">HUD During Gameplay  </w:t>
-      </w:r>
-    </w:p>
-    <w:p>
-      <w:r>
-        <w:t>I want a thin border around the edge of the screen that will have the various UI elements displayed to the player. The goal will be to make it look and feel like the screen the Inferno Jockey is looking at while piloting the drone.</w:t>
-      </w:r>
-    </w:p>
-    <w:p>
-      <w:r>
-        <w:t>Starting in the upper right corner t</w:t>
-      </w:r>
-      <w:r>
-        <w:t xml:space="preserve">here will be one slot in the UI for each type of </w:t>
-      </w:r>
-      <w:proofErr w:type="spellStart"/>
-      <w:r>
-        <w:t>Kytherium</w:t>
-      </w:r>
-      <w:proofErr w:type="spellEnd"/>
-      <w:r>
-        <w:t xml:space="preserve">, a slot for how many they still need to collect to fulfill their contract. If no contract is selected, there will be a warning telling them they should get a contract. There will also be a spot showing the amount of time they have left to turn in their contract. </w:t>
-      </w:r>
-    </w:p>
-    <w:p>
-      <w:r>
-        <w:t xml:space="preserve">Finally, there will be a detonate drone button letting them end the run. If they haven’t tagged any </w:t>
-      </w:r>
-      <w:proofErr w:type="spellStart"/>
-      <w:r>
-        <w:t>Kytherium</w:t>
-      </w:r>
-      <w:proofErr w:type="spellEnd"/>
-      <w:r>
-        <w:t xml:space="preserve"> yet, it will be a recall drone button. Below that, they will have the play screen which will have a view of the drone camera, and a grid showing the 6 lanes (3 on the top half of the screen, and 3 on the bottom half of the screen)</w:t>
-      </w:r>
-      <w:r>
-        <w:t>.</w:t>
-      </w:r>
-    </w:p>
-    <w:p>
-      <w:r>
-        <w:t xml:space="preserve">If I have time, the main menu will have the option to customize both what data is shown on the information bar at the top of the screen and where it is placed. </w:t>
+        <w:t xml:space="preserve">Tutorial and Onboarding  </w:t>
+      </w:r>
+    </w:p>
+    <w:p>
+      <w:r>
+        <w:t xml:space="preserve">For initial release, Will have a simple popup window that will give instructions on playing the game. Will cover moving the ship between lanes, firing, avoiding obstacles, moving around obstacles, destroying obstacles (when possible), setting </w:t>
+      </w:r>
+      <w:r>
+        <w:t xml:space="preserve">drop rates on fuel and laser cores, accepting and turning in contracts, info about managing costs. It will be viewable anytime from the main menu under Operations Manual </w:t>
+      </w:r>
+      <w:r>
+        <w:t xml:space="preserve"> </w:t>
+      </w:r>
+    </w:p>
+    <w:p>
+      <w:r>
+        <w:t xml:space="preserve">Future releases, I will likely upgrade it to a more engaging experience. </w:t>
       </w:r>
     </w:p>
     <w:p>
       <w:pPr>
         <w:pStyle w:val="Heading2"/>
       </w:pPr>
-      <w:r>
-        <w:t xml:space="preserve">Post-Run Screens  </w:t>
-      </w:r>
-    </w:p>
-    <w:p>
-      <w:r>
-        <w:t xml:space="preserve">Bare bones (will build this first and expand later if I have time): Will be shown in a simple pop-up over the play screen. </w:t>
-      </w:r>
-    </w:p>
-    <w:p>
-      <w:r>
-        <w:t xml:space="preserve">Ideal, the screen will shift, as though the Inferno Jockey switched which screen they were looking at and went to look at a report of the run. </w:t>
-      </w:r>
-    </w:p>
-    <w:p>
-      <w:r>
-        <w:t xml:space="preserve">Both will have the same data on it. One will just look fancier. </w:t>
-      </w:r>
-    </w:p>
-    <w:p>
-      <w:r>
-        <w:t>Data shown</w:t>
-      </w:r>
-    </w:p>
-    <w:p>
-      <w:r>
-        <w:t xml:space="preserve">Amount of </w:t>
-      </w:r>
-      <w:proofErr w:type="spellStart"/>
-      <w:r>
-        <w:t>Kytherium</w:t>
-      </w:r>
-      <w:proofErr w:type="spellEnd"/>
-      <w:r>
-        <w:t xml:space="preserve"> needed to fulfil the current contract. </w:t>
-      </w:r>
-    </w:p>
-    <w:p>
-      <w:r>
-        <w:t xml:space="preserve">Payout of current rate of contract for each type of </w:t>
-      </w:r>
-      <w:proofErr w:type="spellStart"/>
-      <w:r>
-        <w:t>Kytherium</w:t>
-      </w:r>
-      <w:proofErr w:type="spellEnd"/>
-      <w:r>
-        <w:t xml:space="preserve"> </w:t>
-      </w:r>
-    </w:p>
-    <w:p>
-      <w:r>
-        <w:t xml:space="preserve">Total </w:t>
-      </w:r>
-      <w:proofErr w:type="spellStart"/>
-      <w:r>
-        <w:t>Kytherium</w:t>
-      </w:r>
-      <w:proofErr w:type="spellEnd"/>
-      <w:r>
-        <w:t xml:space="preserve"> collected of each type since the last contract and the total of all ore combined</w:t>
-      </w:r>
-      <w:r>
-        <w:t xml:space="preserve"> and the estimated payout of each type of </w:t>
-      </w:r>
-      <w:proofErr w:type="spellStart"/>
-      <w:r>
-        <w:t>Kytherium</w:t>
-      </w:r>
-      <w:proofErr w:type="spellEnd"/>
-      <w:r>
-        <w:t xml:space="preserve">. </w:t>
-      </w:r>
-    </w:p>
-    <w:p>
-      <w:r>
-        <w:t xml:space="preserve">Amount of </w:t>
-      </w:r>
-      <w:proofErr w:type="spellStart"/>
-      <w:r>
-        <w:t>Kytherium</w:t>
-      </w:r>
-      <w:proofErr w:type="spellEnd"/>
-      <w:r>
-        <w:t xml:space="preserve"> collected</w:t>
-      </w:r>
-      <w:r>
-        <w:t xml:space="preserve"> from this run</w:t>
-      </w:r>
-      <w:r>
-        <w:t xml:space="preserve"> broken down by type, with total payout from each type. </w:t>
-      </w:r>
-    </w:p>
-    <w:p>
+      <w:proofErr w:type="spellStart"/>
+      <w:r>
+        <w:t>Unlockables</w:t>
+      </w:r>
+      <w:proofErr w:type="spellEnd"/>
+      <w:r>
+        <w:t xml:space="preserve"> and Customization  </w:t>
+      </w:r>
+    </w:p>
+    <w:p>
+      <w:r>
+        <w:t xml:space="preserve">In the initial release, nothing. </w:t>
+      </w:r>
+    </w:p>
+    <w:p>
+      <w:r>
+        <w:t xml:space="preserve">Will brainstorm later for any future </w:t>
+      </w:r>
+      <w:proofErr w:type="spellStart"/>
+      <w:r>
+        <w:t>unlockables</w:t>
+      </w:r>
+      <w:proofErr w:type="spellEnd"/>
+      <w:r>
+        <w:t xml:space="preserve"> and customization. </w:t>
+      </w:r>
+    </w:p>
+    <w:p>
+      <w:pPr>
+        <w:pStyle w:val="Heading2"/>
+      </w:pPr>
+      <w:r>
+        <w:t xml:space="preserve">Art Style and Assets  </w:t>
+      </w:r>
+    </w:p>
+    <w:p>
+      <w:r>
+        <w:t xml:space="preserve">Whatever is free from the Unity Asset Store and at least roughly fits what I’m after. </w:t>
+      </w:r>
+    </w:p>
+    <w:p>
+      <w:pPr>
+        <w:pStyle w:val="Heading2"/>
+      </w:pPr>
       <w:r>
         <w:lastRenderedPageBreak/>
-        <w:t xml:space="preserve">(If applicable) </w:t>
-      </w:r>
-      <w:r>
-        <w:t>T</w:t>
-      </w:r>
-      <w:r>
-        <w:t xml:space="preserve">he amount and type of </w:t>
-      </w:r>
-      <w:proofErr w:type="spellStart"/>
-      <w:r>
-        <w:t>Kytherium</w:t>
-      </w:r>
-      <w:proofErr w:type="spellEnd"/>
-      <w:r>
-        <w:t xml:space="preserve"> lost to pirates</w:t>
-      </w:r>
-      <w:r>
-        <w:t xml:space="preserve"> and its total losses</w:t>
-      </w:r>
-      <w:r>
-        <w:t xml:space="preserve">. </w:t>
-      </w:r>
-    </w:p>
-    <w:p>
-      <w:r>
-        <w:t>Total fuel tanks dropped and the total cost of fuel for the run</w:t>
-      </w:r>
-    </w:p>
-    <w:p>
-      <w:r>
-        <w:t>Total fuel tanks collected</w:t>
-      </w:r>
-    </w:p>
-    <w:p>
-      <w:r>
-        <w:t>Total uncollected fuel tanks and their total cost</w:t>
-      </w:r>
-    </w:p>
-    <w:p>
-      <w:r>
-        <w:t>Total laser cores dropped</w:t>
-      </w:r>
-      <w:r>
-        <w:t xml:space="preserve"> </w:t>
-      </w:r>
-      <w:r>
-        <w:t>and the total cost of laser cores for the run</w:t>
-      </w:r>
-    </w:p>
-    <w:p>
-      <w:r>
-        <w:t>Total laser cores collected</w:t>
-      </w:r>
-    </w:p>
-    <w:p>
-      <w:r>
-        <w:t>Total uncollected laser cores and their cost</w:t>
-      </w:r>
-    </w:p>
-    <w:p>
-      <w:r>
-        <w:t xml:space="preserve">(only to be added if I have time) </w:t>
-      </w:r>
-    </w:p>
-    <w:p>
-      <w:r>
-        <w:t xml:space="preserve">Possible change to drop rate of fuel and laser cores for better control of costs. </w:t>
-      </w:r>
-    </w:p>
-    <w:p>
-      <w:r>
-        <w:t xml:space="preserve">Chart showing fuel and laser core </w:t>
-      </w:r>
-      <w:r>
-        <w:t>usage throughout the run. (Will store only the info for the last run for each region)</w:t>
+        <w:t xml:space="preserve">Sound Design  </w:t>
+      </w:r>
+    </w:p>
+    <w:p>
+      <w:r>
+        <w:t xml:space="preserve">Whatever is free from the Unity Asset Store and at least roughly fits what I’m after. </w:t>
       </w:r>
     </w:p>
     <w:p>
@@ -3477,88 +3578,6 @@
         <w:pStyle w:val="Heading2"/>
       </w:pPr>
       <w:r>
-        <w:t xml:space="preserve">Tutorial and Onboarding  </w:t>
-      </w:r>
-    </w:p>
-    <w:p>
-      <w:r>
-        <w:t xml:space="preserve">For initial release, Will have a simple popup window that will give instructions on playing the game. Will cover moving the ship between lanes, firing, avoiding obstacles, moving around obstacles, destroying obstacles (when possible), setting </w:t>
-      </w:r>
-      <w:r>
-        <w:t xml:space="preserve">drop rates on fuel and laser cores, accepting and turning in contracts, info about managing costs. It will be viewable anytime from the main menu under Operations Manual </w:t>
-      </w:r>
-      <w:r>
-        <w:t xml:space="preserve"> </w:t>
-      </w:r>
-    </w:p>
-    <w:p>
-      <w:r>
-        <w:t xml:space="preserve">Future releases, I will likely upgrade it to a more engaging experience. </w:t>
-      </w:r>
-    </w:p>
-    <w:p>
-      <w:pPr>
-        <w:pStyle w:val="Heading2"/>
-      </w:pPr>
-      <w:proofErr w:type="spellStart"/>
-      <w:r>
-        <w:t>Unlockables</w:t>
-      </w:r>
-      <w:proofErr w:type="spellEnd"/>
-      <w:r>
-        <w:t xml:space="preserve"> and Customization  </w:t>
-      </w:r>
-    </w:p>
-    <w:p>
-      <w:r>
-        <w:t xml:space="preserve">In the initial release, nothing. </w:t>
-      </w:r>
-    </w:p>
-    <w:p>
-      <w:r>
-        <w:t xml:space="preserve">Will brainstorm later for any future </w:t>
-      </w:r>
-      <w:proofErr w:type="spellStart"/>
-      <w:r>
-        <w:t>unlockables</w:t>
-      </w:r>
-      <w:proofErr w:type="spellEnd"/>
-      <w:r>
-        <w:t xml:space="preserve"> and customization. </w:t>
-      </w:r>
-    </w:p>
-    <w:p>
-      <w:pPr>
-        <w:pStyle w:val="Heading2"/>
-      </w:pPr>
-      <w:r>
-        <w:t xml:space="preserve">Art Style and Assets  </w:t>
-      </w:r>
-    </w:p>
-    <w:p>
-      <w:r>
-        <w:t xml:space="preserve">Whatever is free from the Unity Asset Store and at least roughly fits what I’m after. </w:t>
-      </w:r>
-    </w:p>
-    <w:p>
-      <w:pPr>
-        <w:pStyle w:val="Heading2"/>
-      </w:pPr>
-      <w:r>
-        <w:t xml:space="preserve">Sound Design  </w:t>
-      </w:r>
-    </w:p>
-    <w:p>
-      <w:r>
-        <w:t xml:space="preserve">Whatever is free from the Unity Asset Store and at least roughly fits what I’m after. </w:t>
-      </w:r>
-    </w:p>
-    <w:p>
-      <w:pPr>
-        <w:pStyle w:val="Heading2"/>
-      </w:pPr>
-      <w:r>
-        <w:lastRenderedPageBreak/>
         <w:t xml:space="preserve">Animations  </w:t>
       </w:r>
     </w:p>
@@ -3714,6 +3733,7 @@
           <w:b/>
           <w:bCs/>
         </w:rPr>
+        <w:lastRenderedPageBreak/>
         <w:t>Resolution:</w:t>
       </w:r>
       <w:r>
@@ -3741,7 +3761,6 @@
           <w:b/>
           <w:bCs/>
         </w:rPr>
-        <w:lastRenderedPageBreak/>
         <w:t>Object Pooling:</w:t>
       </w:r>
       <w:r>
@@ -3918,6 +3937,7 @@
     </w:p>
     <w:p>
       <w:r>
+        <w:lastRenderedPageBreak/>
         <w:t>Set up Unity Testing environment</w:t>
       </w:r>
     </w:p>
@@ -3928,283 +3948,283 @@
     </w:p>
     <w:p>
       <w:r>
+        <w:t>Testing should be both</w:t>
+      </w:r>
+      <w:r>
+        <w:t xml:space="preserve"> play testing</w:t>
+      </w:r>
+      <w:r>
+        <w:t xml:space="preserve"> and code based testing. </w:t>
+      </w:r>
+    </w:p>
+    <w:p>
+      <w:pPr>
+        <w:pStyle w:val="Heading2"/>
+      </w:pPr>
+      <w:r>
+        <w:t>Possible Updates</w:t>
+      </w:r>
+    </w:p>
+    <w:p>
+      <w:r>
+        <w:t xml:space="preserve">That is an interesting idea. I was trying to figure out how the camera would work, and as I thought about it, the question came to my mind of what if they could only see the equivalent of 4 lanes. Or maybe less. So, if the drone is in lane one, lane one would be centered in the screen, but they could see some of the nearby lanes as well. If I'm going to do that, and not give them a map (which I wouldn't) then I would need to give them way more time between obstacles, but I'm fine with that. that would also mean, I could increase it to a 3 x 3 grid, which would be even more imposing. I'll have to play with the idea in Unity. I kind of like it though. It would really give the feel of flying through the machines harvesting </w:t>
+      </w:r>
+      <w:proofErr w:type="spellStart"/>
+      <w:r>
+        <w:t>Kytherium</w:t>
+      </w:r>
+      <w:proofErr w:type="spellEnd"/>
+      <w:r>
+        <w:t xml:space="preserve">, and would be a huge change from the traditional infinite runner game. </w:t>
+      </w:r>
+    </w:p>
+    <w:p>
+      <w:r>
+        <w:t xml:space="preserve">For changes to UI. There would be buttons in each of the corners and on each edge, this would let them move up, down, left right and diagonally. I would likely disable any button (with visual cues) when they are next to a wall. So, for example, if they are in lane 1, they would be able to move down, right, or diagonal down and to the right. Tapping on the lane would then make it so the drone fires. </w:t>
+      </w:r>
+    </w:p>
+    <w:p>
+      <w:r>
+        <w:t xml:space="preserve">The natural strategy for this would be to always move back to the center lane. If I build it well, then </w:t>
+      </w:r>
+      <w:r>
+        <w:t xml:space="preserve">when you are in the center lane (which would be lane 5) you can get at least a partial view of all 9 lanes. And all I would need to do is to use the grid overlay that I was already planning to give visual </w:t>
+      </w:r>
+      <w:proofErr w:type="spellStart"/>
+      <w:r>
+        <w:t>queues</w:t>
+      </w:r>
+      <w:proofErr w:type="spellEnd"/>
+      <w:r>
+        <w:t xml:space="preserve"> to the player. I would need colors assigned to highlight for safe lanes, lanes with pipes, lanes with pirate spawned obstacles, and lanes with fuel/ammo. I am seriously going to do this. It takes this game from something I was just doing to learn to something I’m seriously excited about building because I want to play it. </w:t>
+      </w:r>
+    </w:p>
+    <w:p>
+      <w:r>
+        <w:t xml:space="preserve">AI feedback on idea. </w:t>
+      </w:r>
+    </w:p>
+    <w:p>
+      <w:r>
+        <w:t>**Great evolution on the controls!** This hybrid approach (on-screen directional buttons + tap-to-fire) should feel much more intentional and console-like than pure invisible lane taps, especially with a dynamic camera.</w:t>
+      </w:r>
+    </w:p>
+    <w:p/>
+    <w:p>
+      <w:r>
+        <w:t>### Refined Control Scheme Suggestion</w:t>
+      </w:r>
+    </w:p>
+    <w:p/>
+    <w:p>
+      <w:r>
         <w:lastRenderedPageBreak/>
-        <w:t>Testing should be both</w:t>
-      </w:r>
-      <w:r>
-        <w:t xml:space="preserve"> play testing</w:t>
-      </w:r>
-      <w:r>
-        <w:t xml:space="preserve"> and code based testing. </w:t>
-      </w:r>
-    </w:p>
-    <w:p>
-      <w:pPr>
-        <w:pStyle w:val="Heading2"/>
-      </w:pPr>
-      <w:r>
-        <w:t>Possible Updates</w:t>
-      </w:r>
-    </w:p>
-    <w:p>
-      <w:r>
-        <w:t xml:space="preserve">That is an interesting idea. I was trying to figure out how the camera would work, and as I thought about it, the question came to my mind of what if they could only see the equivalent of 4 lanes. Or maybe less. So, if the drone is in lane one, lane one would be centered in the screen, but they could see some of the nearby lanes as well. If I'm going to do that, and not give them a map (which I wouldn't) then I would need to give them way more time between obstacles, but I'm fine with that. that would also mean, I could increase it to a 3 x 3 grid, which would be even more imposing. I'll have to play with the idea in Unity. I kind of like it though. It would really give the feel of flying through the machines harvesting </w:t>
-      </w:r>
-      <w:proofErr w:type="spellStart"/>
-      <w:r>
-        <w:t>Kytherium</w:t>
-      </w:r>
-      <w:proofErr w:type="spellEnd"/>
-      <w:r>
-        <w:t xml:space="preserve">, and would be a huge change from the traditional infinite runner game. </w:t>
-      </w:r>
-    </w:p>
-    <w:p>
-      <w:r>
-        <w:t xml:space="preserve">For changes to UI. There would be buttons in each of the corners and on each edge, this would let them move up, down, left right and diagonally. I would likely disable any button (with visual cues) when they are next to a wall. So, for example, if they are in lane 1, they would be able to move down, right, or diagonal down and to the right. Tapping on the lane would then make it so the drone fires. </w:t>
-      </w:r>
-    </w:p>
-    <w:p>
-      <w:r>
-        <w:t xml:space="preserve">The natural strategy for this would be to always move back to the center lane. If I build it well, then </w:t>
-      </w:r>
-      <w:r>
-        <w:t xml:space="preserve">when you are in the center lane (which would be lane 5) you can get at least a partial view of all 9 lanes. And all I would need to do is to use the grid overlay that I was already planning to give visual </w:t>
-      </w:r>
-      <w:proofErr w:type="spellStart"/>
-      <w:r>
-        <w:t>queues</w:t>
-      </w:r>
-      <w:proofErr w:type="spellEnd"/>
-      <w:r>
-        <w:t xml:space="preserve"> to the player. I would need colors assigned to highlight for safe lanes, lanes with pipes, lanes with pirate spawned obstacles, and lanes with fuel/ammo. I am seriously going to do this. It takes this game from something I was just doing to learn to something I’m seriously excited about building because I want to play it. </w:t>
-      </w:r>
-    </w:p>
-    <w:p>
-      <w:r>
-        <w:t xml:space="preserve">AI feedback on idea. </w:t>
-      </w:r>
-    </w:p>
-    <w:p>
-      <w:r>
-        <w:t>**Great evolution on the controls!** This hybrid approach (on-screen directional buttons + tap-to-fire) should feel much more intentional and console-like than pure invisible lane taps, especially with a dynamic camera.</w:t>
+        <w:t>**Layout (Phone Landscape):**</w:t>
+      </w:r>
+    </w:p>
+    <w:p>
+      <w:r>
+        <w:t>- **Main Play Area** = Tap anywhere in the visible gameplay field → **Fire Laser** (in current lane).</w:t>
+      </w:r>
+    </w:p>
+    <w:p>
+      <w:r>
+        <w:t>- **Edge &amp; Corner Overlays** = Movement buttons (semi-transparent, only appear when relevant).</w:t>
       </w:r>
     </w:p>
     <w:p/>
     <w:p>
       <w:r>
-        <w:t>### Refined Control Scheme Suggestion</w:t>
+        <w:t>**8 Direction Movement Buttons:**</w:t>
+      </w:r>
+    </w:p>
+    <w:p>
+      <w:r>
+        <w:t>- 4 corners: Diagonal moves (↖ ↗ ↙ ↘)</w:t>
+      </w:r>
+    </w:p>
+    <w:p>
+      <w:r>
+        <w:t>- 4 edges: Cardinal moves (↑ ↓ ← →)</w:t>
       </w:r>
     </w:p>
     <w:p/>
     <w:p>
       <w:r>
-        <w:t>**Layout (Phone Landscape):**</w:t>
+        <w:t>**Smart Disabling:**</w:t>
+      </w:r>
+    </w:p>
+    <w:p>
+      <w:r>
+        <w:t>- If in Lane 1 (leftmost): Disable left + all left-diagonals (gray them out or fade to 30% opacity + small “X” or slash overlay).</w:t>
+      </w:r>
+    </w:p>
+    <w:p>
+      <w:r>
+        <w:t>- Same for rightmost lane, top/bottom if you add vertical movement limits.</w:t>
+      </w:r>
+    </w:p>
+    <w:p>
+      <w:r>
+        <w:t>- This gives clear visual feedback and prevents “dead taps.”</w:t>
+      </w:r>
+    </w:p>
+    <w:p/>
+    <w:p>
+      <w:r>
+        <w:t>**Visual Style Ideas (Ship Console Theme):**</w:t>
+      </w:r>
+    </w:p>
+    <w:p>
+      <w:r>
+        <w:t>- Buttons look like glowing holographic pads or physical switches with orange/red lava glow accents.</w:t>
+      </w:r>
+    </w:p>
+    <w:p>
+      <w:r>
+        <w:t>- Slight pulse animation when active.</w:t>
+      </w:r>
+    </w:p>
+    <w:p>
+      <w:r>
+        <w:t>- On tap: brief bright flash + engine flare on the drone in that direction.</w:t>
+      </w:r>
+    </w:p>
+    <w:p>
+      <w:r>
+        <w:t>- Hold tap option later for “continuous thrust” if you want.</w:t>
+      </w:r>
+    </w:p>
+    <w:p/>
+    <w:p>
+      <w:r>
+        <w:t>### Pros of This System</w:t>
+      </w:r>
+    </w:p>
+    <w:p>
+      <w:r>
+        <w:t>- Works excellently with a **dynamic/follow camera** — player always knows exactly which directions are available.</w:t>
+      </w:r>
+    </w:p>
+    <w:p>
+      <w:r>
+        <w:t>- Feels more like piloting a real vehicle.</w:t>
       </w:r>
     </w:p>
     <w:p>
       <w:r>
         <w:lastRenderedPageBreak/>
-        <w:t>- **Main Play Area** = Tap anywhere in the visible gameplay field → **Fire Laser** (in current lane).</w:t>
-      </w:r>
-    </w:p>
-    <w:p>
-      <w:r>
-        <w:t>- **Edge &amp; Corner Overlays** = Movement buttons (semi-transparent, only appear when relevant).</w:t>
+        <w:t>- Easier to hit precise movements on a touch screen (bigger targets than tiny lane sections).</w:t>
+      </w:r>
+    </w:p>
+    <w:p>
+      <w:r>
+        <w:t>- Still fast enough for an infinite runner once the player builds muscle memory.</w:t>
       </w:r>
     </w:p>
     <w:p/>
     <w:p>
       <w:r>
-        <w:t>**8 Direction Movement Buttons:**</w:t>
-      </w:r>
-    </w:p>
-    <w:p>
-      <w:r>
-        <w:t>- 4 corners: Diagonal moves (↖ ↗ ↙ ↘)</w:t>
-      </w:r>
-    </w:p>
-    <w:p>
-      <w:r>
-        <w:t>- 4 edges: Cardinal moves (↑ ↓ ← →)</w:t>
+        <w:t>### Potential Issues &amp; Fixes</w:t>
+      </w:r>
+    </w:p>
+    <w:p>
+      <w:r>
+        <w:t xml:space="preserve">1. **Thumb Obstruction** — On phones, thumbs can cover a lot.  </w:t>
+      </w:r>
+    </w:p>
+    <w:p>
+      <w:r>
+        <w:t xml:space="preserve">   → Make buttons small but with generous hitboxes. Place them very close to the screen edges/corners (outside the main gameplay view).</w:t>
       </w:r>
     </w:p>
     <w:p/>
     <w:p>
       <w:r>
-        <w:t>**Smart Disabling:**</w:t>
-      </w:r>
-    </w:p>
-    <w:p>
-      <w:r>
-        <w:t>- If in Lane 1 (leftmost): Disable left + all left-diagonals (gray them out or fade to 30% opacity + small “X” or slash overlay).</w:t>
-      </w:r>
-    </w:p>
-    <w:p>
-      <w:r>
-        <w:t>- Same for rightmost lane, top/bottom if you add vertical movement limits.</w:t>
-      </w:r>
-    </w:p>
-    <w:p>
-      <w:r>
-        <w:t>- This gives clear visual feedback and prevents “dead taps.”</w:t>
+        <w:t xml:space="preserve">2. **Accidental Fires** — Player might tap to move but hit the center instead.  </w:t>
+      </w:r>
+    </w:p>
+    <w:p>
+      <w:r>
+        <w:t xml:space="preserve">   → Add a short cooldown (0.1s) after movement or make the fire area slightly inset from the button zones.</w:t>
       </w:r>
     </w:p>
     <w:p/>
     <w:p>
       <w:r>
-        <w:t>**Visual Style Ideas (Ship Console Theme):**</w:t>
-      </w:r>
-    </w:p>
-    <w:p>
-      <w:r>
-        <w:t>- Buttons look like glowing holographic pads or physical switches with orange/red lava glow accents.</w:t>
-      </w:r>
-    </w:p>
-    <w:p>
-      <w:r>
-        <w:t>- Slight pulse animation when active.</w:t>
-      </w:r>
-    </w:p>
-    <w:p>
-      <w:r>
-        <w:t>- On tap: brief bright flash + engine flare on the drone in that direction.</w:t>
-      </w:r>
-    </w:p>
-    <w:p>
-      <w:r>
-        <w:t>- Hold tap option later for “continuous thrust” if you want.</w:t>
+        <w:t xml:space="preserve">3. **Clutter** — 8 buttons + HUD could get busy.  </w:t>
+      </w:r>
+    </w:p>
+    <w:p>
+      <w:r>
+        <w:t xml:space="preserve">   → Make them fade in/out based on context, or use a single “virtual D-pad” area on the left side + fire anywhere else.</w:t>
       </w:r>
     </w:p>
     <w:p/>
     <w:p>
       <w:r>
-        <w:t>### Pros of This System</w:t>
-      </w:r>
-    </w:p>
-    <w:p>
-      <w:r>
-        <w:t>- Works excellently with a **dynamic/follow camera** — player always knows exactly which directions are available.</w:t>
-      </w:r>
-    </w:p>
-    <w:p>
-      <w:r>
-        <w:t>- Feels more like piloting a real vehicle.</w:t>
-      </w:r>
-    </w:p>
-    <w:p>
-      <w:r>
-        <w:t>- Easier to hit precise movements on a touch screen (bigger targets than tiny lane sections).</w:t>
-      </w:r>
-    </w:p>
+        <w:t xml:space="preserve">4. **Reaction Time** — With directional buttons, movement has a tiny extra cognitive step.  </w:t>
+      </w:r>
+    </w:p>
+    <w:p>
+      <w:r>
+        <w:t xml:space="preserve">   → Compensate with generous spawn distance and responsive drone physics.</w:t>
+      </w:r>
+    </w:p>
+    <w:p/>
+    <w:p>
+      <w:r>
+        <w:t>### Unity Implementation Tips</w:t>
+      </w:r>
+    </w:p>
+    <w:p>
+      <w:r>
+        <w:t>- Use `</w:t>
+      </w:r>
+      <w:proofErr w:type="spellStart"/>
+      <w:r>
+        <w:t>UnityEngine.UI</w:t>
+      </w:r>
+      <w:proofErr w:type="spellEnd"/>
+      <w:r>
+        <w:t>` buttons or better — `UI Toolkit` for cleaner mobile performance.</w:t>
+      </w:r>
+    </w:p>
+    <w:p>
+      <w:r>
+        <w:t>- Or create a custom input zone system with `</w:t>
+      </w:r>
+      <w:proofErr w:type="spellStart"/>
+      <w:r>
+        <w:t>RectTransform</w:t>
+      </w:r>
+      <w:proofErr w:type="spellEnd"/>
+      <w:r>
+        <w:t>` + `</w:t>
+      </w:r>
+      <w:proofErr w:type="spellStart"/>
+      <w:r>
+        <w:t>EventTrigger</w:t>
+      </w:r>
+      <w:proofErr w:type="spellEnd"/>
+      <w:r>
+        <w:t>` for each direction.</w:t>
+      </w:r>
+    </w:p>
+    <w:p>
+      <w:r>
+        <w:t>- Map the 6 (or 9) lanes to an array and calculate which directions are valid based on current lane index.</w:t>
+      </w:r>
+    </w:p>
+    <w:p>
+      <w:r>
+        <w:t>- Add swipe gesture support as an optional advanced control for PC/web players.</w:t>
+      </w:r>
+    </w:p>
+    <w:p/>
     <w:p>
       <w:r>
         <w:lastRenderedPageBreak/>
-        <w:t>- Still fast enough for an infinite runner once the player builds muscle memory.</w:t>
-      </w:r>
-    </w:p>
-    <w:p/>
-    <w:p>
-      <w:r>
-        <w:t>### Potential Issues &amp; Fixes</w:t>
-      </w:r>
-    </w:p>
-    <w:p>
-      <w:r>
-        <w:t xml:space="preserve">1. **Thumb Obstruction** — On phones, thumbs can cover a lot.  </w:t>
-      </w:r>
-    </w:p>
-    <w:p>
-      <w:r>
-        <w:t xml:space="preserve">   → Make buttons small but with generous hitboxes. Place them very close to the screen edges/corners (outside the main gameplay view).</w:t>
-      </w:r>
-    </w:p>
-    <w:p/>
-    <w:p>
-      <w:r>
-        <w:t xml:space="preserve">2. **Accidental Fires** — Player might tap to move but hit the center instead.  </w:t>
-      </w:r>
-    </w:p>
-    <w:p>
-      <w:r>
-        <w:t xml:space="preserve">   → Add a short cooldown (0.1s) after movement or make the fire area slightly inset from the button zones.</w:t>
-      </w:r>
-    </w:p>
-    <w:p/>
-    <w:p>
-      <w:r>
-        <w:t xml:space="preserve">3. **Clutter** — 8 buttons + HUD could get busy.  </w:t>
-      </w:r>
-    </w:p>
-    <w:p>
-      <w:r>
-        <w:t xml:space="preserve">   → Make them fade in/out based on context, or use a single “virtual D-pad” area on the left side + fire anywhere else.</w:t>
-      </w:r>
-    </w:p>
-    <w:p/>
-    <w:p>
-      <w:r>
-        <w:t xml:space="preserve">4. **Reaction Time** — With directional buttons, movement has a tiny extra cognitive step.  </w:t>
-      </w:r>
-    </w:p>
-    <w:p>
-      <w:r>
-        <w:t xml:space="preserve">   → Compensate with generous spawn distance and responsive drone physics.</w:t>
-      </w:r>
-    </w:p>
-    <w:p/>
-    <w:p>
-      <w:r>
-        <w:t>### Unity Implementation Tips</w:t>
-      </w:r>
-    </w:p>
-    <w:p>
-      <w:r>
-        <w:t>- Use `</w:t>
-      </w:r>
-      <w:proofErr w:type="spellStart"/>
-      <w:r>
-        <w:t>UnityEngine.UI</w:t>
-      </w:r>
-      <w:proofErr w:type="spellEnd"/>
-      <w:r>
-        <w:t>` buttons or better — `UI Toolkit` for cleaner mobile performance.</w:t>
-      </w:r>
-    </w:p>
-    <w:p>
-      <w:r>
-        <w:t>- Or create a custom input zone system with `</w:t>
-      </w:r>
-      <w:proofErr w:type="spellStart"/>
-      <w:r>
-        <w:t>RectTransform</w:t>
-      </w:r>
-      <w:proofErr w:type="spellEnd"/>
-      <w:r>
-        <w:t>` + `</w:t>
-      </w:r>
-      <w:proofErr w:type="spellStart"/>
-      <w:r>
-        <w:t>EventTrigger</w:t>
-      </w:r>
-      <w:proofErr w:type="spellEnd"/>
-      <w:r>
-        <w:t>` for each direction.</w:t>
-      </w:r>
-    </w:p>
-    <w:p>
-      <w:r>
-        <w:t>- Map the 6 (or 9) lanes to an array and calculate which directions are valid based on current lane index.</w:t>
-      </w:r>
-    </w:p>
-    <w:p>
-      <w:r>
-        <w:t>- Add swipe gesture support as an optional advanced control for PC/web players.</w:t>
-      </w:r>
-    </w:p>
-    <w:p/>
-    <w:p>
-      <w:r>
         <w:t>---</w:t>
       </w:r>
     </w:p>

</xml_diff>